<commit_message>
Update High Concept Document Template.docx
</commit_message>
<xml_diff>
--- a/Assets/High Concept Document Template.docx
+++ b/Assets/High Concept Document Template.docx
@@ -127,21 +127,7 @@
                 <w:rFonts w:ascii="Arial Narrow" w:hAnsi="Arial Narrow"/>
                 <w:sz w:val="20"/>
               </w:rPr>
-              <w:t>(</w:t>
-            </w:r>
-            <w:r>
-              <w:rPr>
-                <w:rFonts w:ascii="Arial Narrow" w:hAnsi="Arial Narrow"/>
-                <w:sz w:val="20"/>
-              </w:rPr>
-              <w:t xml:space="preserve">age or other </w:t>
-            </w:r>
-            <w:r>
-              <w:rPr>
-                <w:rFonts w:ascii="Arial Narrow" w:hAnsi="Arial Narrow"/>
-                <w:sz w:val="20"/>
-              </w:rPr>
-              <w:t>demographics)</w:t>
+              <w:t>14-25yrs old</w:t>
             </w:r>
           </w:p>
           <w:p>
@@ -173,7 +159,7 @@
                 <w:rFonts w:ascii="Arial Narrow" w:hAnsi="Arial Narrow"/>
                 <w:sz w:val="20"/>
               </w:rPr>
-              <w:t>(core/casual)</w:t>
+              <w:t>regular gamer, casual puzzler</w:t>
             </w:r>
           </w:p>
           <w:p>
@@ -205,9 +191,11 @@
             <w:r>
               <w:rPr>
                 <w:rFonts w:ascii="Arial Narrow" w:hAnsi="Arial Narrow"/>
+                <w:b/>
+                <w:bCs/>
                 <w:sz w:val="20"/>
               </w:rPr>
-              <w:t>____________</w:t>
+              <w:t>PC</w:t>
             </w:r>
           </w:p>
           <w:p>
@@ -398,6 +386,67 @@
           <w:right w:val="single" w:sz="4" w:space="4" w:color="auto"/>
         </w:pBdr>
       </w:pPr>
+      <w:r>
+        <w:rPr>
+          <w:noProof/>
+        </w:rPr>
+        <w:drawing>
+          <wp:anchor distT="0" distB="0" distL="114300" distR="114300" simplePos="0" relativeHeight="251658240" behindDoc="0" locked="0" layoutInCell="1" allowOverlap="1" wp14:anchorId="2D1F8CF7" wp14:editId="2DD1DC69">
+            <wp:simplePos x="0" y="0"/>
+            <wp:positionH relativeFrom="margin">
+              <wp:posOffset>396240</wp:posOffset>
+            </wp:positionH>
+            <wp:positionV relativeFrom="paragraph">
+              <wp:posOffset>11430</wp:posOffset>
+            </wp:positionV>
+            <wp:extent cx="3802380" cy="2095500"/>
+            <wp:effectExtent l="0" t="0" r="7620" b="0"/>
+            <wp:wrapSquare wrapText="bothSides"/>
+            <wp:docPr id="5" name="Picture 1"/>
+            <wp:cNvGraphicFramePr>
+              <a:graphicFrameLocks xmlns:a="http://schemas.openxmlformats.org/drawingml/2006/main" noChangeAspect="1"/>
+            </wp:cNvGraphicFramePr>
+            <a:graphic xmlns:a="http://schemas.openxmlformats.org/drawingml/2006/main">
+              <a:graphicData uri="http://schemas.openxmlformats.org/drawingml/2006/picture">
+                <pic:pic xmlns:pic="http://schemas.openxmlformats.org/drawingml/2006/picture">
+                  <pic:nvPicPr>
+                    <pic:cNvPr id="0" name="Picture 5"/>
+                    <pic:cNvPicPr>
+                      <a:picLocks noChangeAspect="1" noChangeArrowheads="1"/>
+                    </pic:cNvPicPr>
+                  </pic:nvPicPr>
+                  <pic:blipFill>
+                    <a:blip r:embed="rId7">
+                      <a:extLst>
+                        <a:ext uri="{28A0092B-C50C-407E-A947-70E740481C1C}">
+                          <a14:useLocalDpi xmlns:a14="http://schemas.microsoft.com/office/drawing/2010/main" val="0"/>
+                        </a:ext>
+                      </a:extLst>
+                    </a:blip>
+                    <a:srcRect/>
+                    <a:stretch>
+                      <a:fillRect/>
+                    </a:stretch>
+                  </pic:blipFill>
+                  <pic:spPr bwMode="auto">
+                    <a:xfrm>
+                      <a:off x="0" y="0"/>
+                      <a:ext cx="3802380" cy="2095500"/>
+                    </a:xfrm>
+                    <a:prstGeom prst="rect">
+                      <a:avLst/>
+                    </a:prstGeom>
+                    <a:noFill/>
+                    <a:ln>
+                      <a:noFill/>
+                    </a:ln>
+                  </pic:spPr>
+                </pic:pic>
+              </a:graphicData>
+            </a:graphic>
+          </wp:anchor>
+        </w:drawing>
+      </w:r>
     </w:p>
     <w:p>
       <w:pPr>
@@ -528,6 +577,64 @@
           <w:right w:val="single" w:sz="4" w:space="4" w:color="auto"/>
         </w:pBdr>
       </w:pPr>
+      <w:r>
+        <w:rPr>
+          <w:noProof/>
+        </w:rPr>
+        <w:drawing>
+          <wp:anchor distT="0" distB="0" distL="114300" distR="114300" simplePos="0" relativeHeight="251659264" behindDoc="0" locked="0" layoutInCell="1" allowOverlap="1" wp14:anchorId="0AD1F40A" wp14:editId="2EBCE532">
+            <wp:simplePos x="0" y="0"/>
+            <wp:positionH relativeFrom="margin">
+              <wp:posOffset>1146175</wp:posOffset>
+            </wp:positionH>
+            <wp:positionV relativeFrom="paragraph">
+              <wp:posOffset>4445</wp:posOffset>
+            </wp:positionV>
+            <wp:extent cx="2478405" cy="1561465"/>
+            <wp:effectExtent l="0" t="0" r="0" b="635"/>
+            <wp:wrapSquare wrapText="bothSides"/>
+            <wp:docPr id="50583464" name="Picture 2"/>
+            <wp:cNvGraphicFramePr>
+              <a:graphicFrameLocks xmlns:a="http://schemas.openxmlformats.org/drawingml/2006/main" noChangeAspect="1"/>
+            </wp:cNvGraphicFramePr>
+            <a:graphic xmlns:a="http://schemas.openxmlformats.org/drawingml/2006/main">
+              <a:graphicData uri="http://schemas.openxmlformats.org/drawingml/2006/picture">
+                <pic:pic xmlns:pic="http://schemas.openxmlformats.org/drawingml/2006/picture">
+                  <pic:nvPicPr>
+                    <pic:cNvPr id="0" name="Picture 3"/>
+                    <pic:cNvPicPr>
+                      <a:picLocks noChangeAspect="1" noChangeArrowheads="1"/>
+                    </pic:cNvPicPr>
+                  </pic:nvPicPr>
+                  <pic:blipFill>
+                    <a:blip r:embed="rId8">
+                      <a:extLst>
+                        <a:ext uri="{28A0092B-C50C-407E-A947-70E740481C1C}">
+                          <a14:useLocalDpi xmlns:a14="http://schemas.microsoft.com/office/drawing/2010/main" val="0"/>
+                        </a:ext>
+                      </a:extLst>
+                    </a:blip>
+                    <a:srcRect/>
+                    <a:stretch>
+                      <a:fillRect/>
+                    </a:stretch>
+                  </pic:blipFill>
+                  <pic:spPr bwMode="auto">
+                    <a:xfrm>
+                      <a:off x="0" y="0"/>
+                      <a:ext cx="2478405" cy="1561465"/>
+                    </a:xfrm>
+                    <a:prstGeom prst="rect">
+                      <a:avLst/>
+                    </a:prstGeom>
+                    <a:noFill/>
+                  </pic:spPr>
+                </pic:pic>
+              </a:graphicData>
+            </a:graphic>
+          </wp:anchor>
+        </w:drawing>
+      </w:r>
     </w:p>
     <w:p>
       <w:pPr>
@@ -562,6 +669,208 @@
     <w:p>
       <w:pPr>
         <w:pBdr>
+          <w:top w:val="single" w:sz="4" w:space="1" w:color="auto"/>
+          <w:left w:val="single" w:sz="4" w:space="4" w:color="auto"/>
+          <w:bottom w:val="single" w:sz="4" w:space="1" w:color="auto"/>
+          <w:right w:val="single" w:sz="4" w:space="4" w:color="auto"/>
+        </w:pBdr>
+      </w:pPr>
+    </w:p>
+    <w:p>
+      <w:pPr>
+        <w:pBdr>
+          <w:top w:val="single" w:sz="4" w:space="1" w:color="auto"/>
+          <w:left w:val="single" w:sz="4" w:space="4" w:color="auto"/>
+          <w:bottom w:val="single" w:sz="4" w:space="1" w:color="auto"/>
+          <w:right w:val="single" w:sz="4" w:space="4" w:color="auto"/>
+        </w:pBdr>
+      </w:pPr>
+      <w:r>
+        <w:rPr>
+          <w:noProof/>
+        </w:rPr>
+        <mc:AlternateContent>
+          <mc:Choice Requires="wps">
+            <w:drawing>
+              <wp:inline distT="0" distB="0" distL="0" distR="0" wp14:anchorId="7BF0A5C4" wp14:editId="7E19441B">
+                <wp:extent cx="304800" cy="304800"/>
+                <wp:effectExtent l="0" t="0" r="0" b="0"/>
+                <wp:docPr id="25364319" name="Rectangle 1"/>
+                <wp:cNvGraphicFramePr>
+                  <a:graphicFrameLocks xmlns:a="http://schemas.openxmlformats.org/drawingml/2006/main" noChangeAspect="1"/>
+                </wp:cNvGraphicFramePr>
+                <a:graphic xmlns:a="http://schemas.openxmlformats.org/drawingml/2006/main">
+                  <a:graphicData uri="http://schemas.microsoft.com/office/word/2010/wordprocessingShape">
+                    <wps:wsp>
+                      <wps:cNvSpPr>
+                        <a:spLocks noChangeAspect="1" noChangeArrowheads="1"/>
+                      </wps:cNvSpPr>
+                      <wps:spPr bwMode="auto">
+                        <a:xfrm>
+                          <a:off x="0" y="0"/>
+                          <a:ext cx="304800" cy="304800"/>
+                        </a:xfrm>
+                        <a:prstGeom prst="rect">
+                          <a:avLst/>
+                        </a:prstGeom>
+                        <a:noFill/>
+                        <a:ln>
+                          <a:noFill/>
+                        </a:ln>
+                        <a:extLst>
+                          <a:ext uri="{909E8E84-426E-40DD-AFC4-6F175D3DCCD1}">
+                            <a14:hiddenFill xmlns:a14="http://schemas.microsoft.com/office/drawing/2010/main">
+                              <a:solidFill>
+                                <a:srgbClr val="FFFFFF"/>
+                              </a:solidFill>
+                            </a14:hiddenFill>
+                          </a:ext>
+                          <a:ext uri="{91240B29-F687-4F45-9708-019B960494DF}">
+                            <a14:hiddenLine xmlns:a14="http://schemas.microsoft.com/office/drawing/2010/main" w="9525">
+                              <a:solidFill>
+                                <a:srgbClr val="000000"/>
+                              </a:solidFill>
+                              <a:miter lim="800000"/>
+                              <a:headEnd/>
+                              <a:tailEnd/>
+                            </a14:hiddenLine>
+                          </a:ext>
+                        </a:extLst>
+                      </wps:spPr>
+                      <wps:bodyPr rot="0" vert="horz" wrap="square" lIns="91440" tIns="45720" rIns="91440" bIns="45720" anchor="t" anchorCtr="0" upright="1">
+                        <a:noAutofit/>
+                      </wps:bodyPr>
+                    </wps:wsp>
+                  </a:graphicData>
+                </a:graphic>
+              </wp:inline>
+            </w:drawing>
+          </mc:Choice>
+          <mc:Fallback>
+            <w:pict>
+              <v:rect w14:anchorId="48A83B4E" id="Rectangle 1" o:spid="_x0000_s1026" style="width:24pt;height:24pt;visibility:visible;mso-wrap-style:square;mso-left-percent:-10001;mso-top-percent:-10001;mso-position-horizontal:absolute;mso-position-horizontal-relative:char;mso-position-vertical:absolute;mso-position-vertical-relative:line;mso-left-percent:-10001;mso-top-percent:-10001;v-text-anchor:top" o:gfxdata="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" filled="f" stroked="f">
+                <o:lock v:ext="edit" aspectratio="t"/>
+                <w10:anchorlock/>
+              </v:rect>
+            </w:pict>
+          </mc:Fallback>
+        </mc:AlternateContent>
+      </w:r>
+      <w:r>
+        <w:rPr>
+          <w:noProof/>
+        </w:rPr>
+        <mc:AlternateContent>
+          <mc:Choice Requires="wps">
+            <w:drawing>
+              <wp:inline distT="0" distB="0" distL="0" distR="0" wp14:anchorId="6830C5E8" wp14:editId="3225552F">
+                <wp:extent cx="304800" cy="304800"/>
+                <wp:effectExtent l="0" t="0" r="0" b="0"/>
+                <wp:docPr id="298576994" name="AutoShape 3"/>
+                <wp:cNvGraphicFramePr>
+                  <a:graphicFrameLocks xmlns:a="http://schemas.openxmlformats.org/drawingml/2006/main" noChangeAspect="1"/>
+                </wp:cNvGraphicFramePr>
+                <a:graphic xmlns:a="http://schemas.openxmlformats.org/drawingml/2006/main">
+                  <a:graphicData uri="http://schemas.microsoft.com/office/word/2010/wordprocessingShape">
+                    <wps:wsp>
+                      <wps:cNvSpPr>
+                        <a:spLocks noChangeAspect="1" noChangeArrowheads="1"/>
+                      </wps:cNvSpPr>
+                      <wps:spPr bwMode="auto">
+                        <a:xfrm>
+                          <a:off x="0" y="0"/>
+                          <a:ext cx="304800" cy="304800"/>
+                        </a:xfrm>
+                        <a:prstGeom prst="rect">
+                          <a:avLst/>
+                        </a:prstGeom>
+                        <a:noFill/>
+                        <a:ln>
+                          <a:noFill/>
+                        </a:ln>
+                        <a:extLst>
+                          <a:ext uri="{909E8E84-426E-40DD-AFC4-6F175D3DCCD1}">
+                            <a14:hiddenFill xmlns:a14="http://schemas.microsoft.com/office/drawing/2010/main">
+                              <a:solidFill>
+                                <a:srgbClr val="FFFFFF"/>
+                              </a:solidFill>
+                            </a14:hiddenFill>
+                          </a:ext>
+                          <a:ext uri="{91240B29-F687-4F45-9708-019B960494DF}">
+                            <a14:hiddenLine xmlns:a14="http://schemas.microsoft.com/office/drawing/2010/main" w="9525">
+                              <a:solidFill>
+                                <a:srgbClr val="000000"/>
+                              </a:solidFill>
+                              <a:miter lim="800000"/>
+                              <a:headEnd/>
+                              <a:tailEnd/>
+                            </a14:hiddenLine>
+                          </a:ext>
+                        </a:extLst>
+                      </wps:spPr>
+                      <wps:bodyPr rot="0" vert="horz" wrap="square" lIns="91440" tIns="45720" rIns="91440" bIns="45720" anchor="t" anchorCtr="0" upright="1">
+                        <a:noAutofit/>
+                      </wps:bodyPr>
+                    </wps:wsp>
+                  </a:graphicData>
+                </a:graphic>
+              </wp:inline>
+            </w:drawing>
+          </mc:Choice>
+          <mc:Fallback>
+            <w:pict>
+              <v:rect w14:anchorId="5343D463" id="AutoShape 3" o:spid="_x0000_s1026" style="width:24pt;height:24pt;visibility:visible;mso-wrap-style:square;mso-left-percent:-10001;mso-top-percent:-10001;mso-position-horizontal:absolute;mso-position-horizontal-relative:char;mso-position-vertical:absolute;mso-position-vertical-relative:line;mso-left-percent:-10001;mso-top-percent:-10001;v-text-anchor:top" o:gfxdata="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" filled="f" stroked="f">
+                <o:lock v:ext="edit" aspectratio="t"/>
+                <w10:anchorlock/>
+              </v:rect>
+            </w:pict>
+          </mc:Fallback>
+        </mc:AlternateContent>
+      </w:r>
+    </w:p>
+    <w:p>
+      <w:pPr>
+        <w:pBdr>
+          <w:top w:val="single" w:sz="4" w:space="1" w:color="auto"/>
+          <w:left w:val="single" w:sz="4" w:space="4" w:color="auto"/>
+          <w:bottom w:val="single" w:sz="4" w:space="1" w:color="auto"/>
+          <w:right w:val="single" w:sz="4" w:space="4" w:color="auto"/>
+        </w:pBdr>
+      </w:pPr>
+    </w:p>
+    <w:p>
+      <w:pPr>
+        <w:pBdr>
+          <w:top w:val="single" w:sz="4" w:space="1" w:color="auto"/>
+          <w:left w:val="single" w:sz="4" w:space="4" w:color="auto"/>
+          <w:bottom w:val="single" w:sz="4" w:space="1" w:color="auto"/>
+          <w:right w:val="single" w:sz="4" w:space="4" w:color="auto"/>
+        </w:pBdr>
+      </w:pPr>
+    </w:p>
+    <w:p>
+      <w:pPr>
+        <w:pBdr>
+          <w:top w:val="single" w:sz="4" w:space="1" w:color="auto"/>
+          <w:left w:val="single" w:sz="4" w:space="4" w:color="auto"/>
+          <w:bottom w:val="single" w:sz="4" w:space="1" w:color="auto"/>
+          <w:right w:val="single" w:sz="4" w:space="4" w:color="auto"/>
+        </w:pBdr>
+      </w:pPr>
+    </w:p>
+    <w:p>
+      <w:pPr>
+        <w:pBdr>
+          <w:top w:val="single" w:sz="4" w:space="1" w:color="auto"/>
+          <w:left w:val="single" w:sz="4" w:space="4" w:color="auto"/>
+          <w:bottom w:val="single" w:sz="4" w:space="1" w:color="auto"/>
+          <w:right w:val="single" w:sz="4" w:space="4" w:color="auto"/>
+        </w:pBdr>
+      </w:pPr>
+    </w:p>
+    <w:p>
+      <w:pPr>
+        <w:pBdr>
           <w:bottom w:val="single" w:sz="4" w:space="1" w:color="auto"/>
         </w:pBdr>
       </w:pPr>
@@ -569,7 +878,6 @@
     <w:p>
       <w:pPr>
         <w:pStyle w:val="NormalWeb"/>
-        <w:ind w:left="720"/>
         <w:rPr>
           <w:rFonts w:ascii="Arial Narrow" w:hAnsi="Arial Narrow"/>
           <w:b/>
@@ -577,34 +885,7 @@
           <w:szCs w:val="20"/>
         </w:rPr>
       </w:pPr>
-      <w:r>
-        <w:rPr>
-          <w:rFonts w:ascii="Arial Narrow" w:hAnsi="Arial Narrow"/>
-          <w:b/>
-          <w:sz w:val="20"/>
-          <w:szCs w:val="20"/>
-        </w:rPr>
-        <w:t xml:space="preserve">Please delete the instructions below upon completion of section. </w:t>
-      </w:r>
-    </w:p>
-    <w:p>
-      <w:pPr>
-        <w:pStyle w:val="NormalWeb"/>
-        <w:ind w:left="720"/>
-        <w:rPr>
-          <w:rFonts w:ascii="Arial Narrow" w:hAnsi="Arial Narrow" w:cs="Tahoma"/>
-          <w:sz w:val="20"/>
-        </w:rPr>
-      </w:pPr>
-      <w:r>
-        <w:rPr>
-          <w:rFonts w:ascii="Arial Narrow" w:hAnsi="Arial Narrow" w:cs="Tahoma"/>
-          <w:sz w:val="20"/>
-        </w:rPr>
-        <w:t>Include a visual image that communicates the concept or visual aesthetic of the game or gets the audience excited about the game. The concept image could be a custom sketch, painting, or a mashup of images from other games/media.</w:t>
-      </w:r>
-    </w:p>
-    <w:p/>
+    </w:p>
     <w:p>
       <w:r>
         <w:br w:type="page"/>
@@ -690,303 +971,6 @@
     <w:p>
       <w:pPr>
         <w:pStyle w:val="NormalWeb"/>
-        <w:ind w:left="720"/>
-        <w:rPr>
-          <w:rFonts w:ascii="Arial Narrow" w:hAnsi="Arial Narrow"/>
-          <w:b/>
-          <w:sz w:val="20"/>
-          <w:szCs w:val="20"/>
-        </w:rPr>
-      </w:pPr>
-      <w:r>
-        <w:rPr>
-          <w:rFonts w:ascii="Arial Narrow" w:hAnsi="Arial Narrow"/>
-          <w:b/>
-          <w:sz w:val="20"/>
-          <w:szCs w:val="20"/>
-        </w:rPr>
-        <w:t xml:space="preserve">Please delete the instructions below upon completion of section. </w:t>
-      </w:r>
-    </w:p>
-    <w:p>
-      <w:pPr>
-        <w:pStyle w:val="NormalWeb"/>
-        <w:ind w:left="720"/>
-        <w:rPr>
-          <w:rFonts w:ascii="Arial Narrow" w:hAnsi="Arial Narrow" w:cs="Tahoma"/>
-          <w:sz w:val="20"/>
-        </w:rPr>
-      </w:pPr>
-      <w:r>
-        <w:rPr>
-          <w:rFonts w:ascii="Arial Narrow" w:hAnsi="Arial Narrow" w:cs="Tahoma"/>
-          <w:sz w:val="20"/>
-        </w:rPr>
-        <w:t xml:space="preserve">This should be one to three paragraphs that describe your game in a concise fashion. Remember, your goal is to </w:t>
-      </w:r>
-      <w:r>
-        <w:rPr>
-          <w:rFonts w:ascii="Arial Narrow" w:hAnsi="Arial Narrow" w:cs="Tahoma"/>
-          <w:b/>
-          <w:sz w:val="20"/>
-        </w:rPr>
-        <w:t>sell</w:t>
-      </w:r>
-      <w:r>
-        <w:rPr>
-          <w:rFonts w:ascii="Arial Narrow" w:hAnsi="Arial Narrow" w:cs="Tahoma"/>
-          <w:sz w:val="20"/>
-        </w:rPr>
-        <w:t xml:space="preserve"> your vision to others. Make it compelling!</w:t>
-      </w:r>
-      <w:r>
-        <w:rPr>
-          <w:rFonts w:ascii="Arial Narrow" w:hAnsi="Arial Narrow" w:cs="Tahoma"/>
-          <w:sz w:val="20"/>
-        </w:rPr>
-        <w:t xml:space="preserve"> It should answer:</w:t>
-      </w:r>
-    </w:p>
-    <w:p>
-      <w:pPr>
-        <w:pStyle w:val="NormalWeb"/>
-        <w:numPr>
-          <w:ilvl w:val="0"/>
-          <w:numId w:val="14"/>
-        </w:numPr>
-        <w:rPr>
-          <w:rFonts w:ascii="Arial Narrow" w:hAnsi="Arial Narrow" w:cs="Tahoma"/>
-          <w:sz w:val="20"/>
-        </w:rPr>
-      </w:pPr>
-      <w:r>
-        <w:rPr>
-          <w:rFonts w:ascii="Arial Narrow" w:hAnsi="Arial Narrow" w:cs="Tahoma"/>
-          <w:sz w:val="20"/>
-        </w:rPr>
-        <w:t>How is this game unique? What differentiates it from other games? (</w:t>
-      </w:r>
-      <w:r>
-        <w:rPr>
-          <w:rFonts w:ascii="Arial Narrow" w:hAnsi="Arial Narrow" w:cs="Tahoma"/>
-          <w:sz w:val="20"/>
-        </w:rPr>
-        <w:t>What is the “X” of your game)</w:t>
-      </w:r>
-    </w:p>
-    <w:p>
-      <w:pPr>
-        <w:pStyle w:val="NormalWeb"/>
-        <w:numPr>
-          <w:ilvl w:val="0"/>
-          <w:numId w:val="14"/>
-        </w:numPr>
-        <w:rPr>
-          <w:rFonts w:ascii="Arial Narrow" w:hAnsi="Arial Narrow" w:cs="Tahoma"/>
-          <w:sz w:val="20"/>
-        </w:rPr>
-      </w:pPr>
-      <w:r>
-        <w:rPr>
-          <w:rFonts w:ascii="Arial Narrow" w:hAnsi="Arial Narrow" w:cs="Tahoma"/>
-          <w:sz w:val="20"/>
-        </w:rPr>
-        <w:t>Who is the player? (target audience and player type)</w:t>
-      </w:r>
-    </w:p>
-    <w:p>
-      <w:pPr>
-        <w:pStyle w:val="NormalWeb"/>
-        <w:numPr>
-          <w:ilvl w:val="0"/>
-          <w:numId w:val="14"/>
-        </w:numPr>
-        <w:rPr>
-          <w:rFonts w:ascii="Arial Narrow" w:hAnsi="Arial Narrow" w:cs="Tahoma"/>
-          <w:sz w:val="20"/>
-        </w:rPr>
-      </w:pPr>
-      <w:r>
-        <w:rPr>
-          <w:rFonts w:ascii="Arial Narrow" w:hAnsi="Arial Narrow" w:cs="Tahoma"/>
-          <w:sz w:val="20"/>
-        </w:rPr>
-        <w:t>What does the player do? (</w:t>
-      </w:r>
-      <w:r>
-        <w:rPr>
-          <w:rFonts w:ascii="Arial Narrow" w:hAnsi="Arial Narrow" w:cs="Tahoma"/>
-          <w:sz w:val="20"/>
-        </w:rPr>
-        <w:t>role they play, core mechanics, genre, controls</w:t>
-      </w:r>
-      <w:r>
-        <w:rPr>
-          <w:rFonts w:ascii="Arial Narrow" w:hAnsi="Arial Narrow" w:cs="Tahoma"/>
-          <w:sz w:val="20"/>
-        </w:rPr>
-        <w:t xml:space="preserve">) </w:t>
-      </w:r>
-    </w:p>
-    <w:p>
-      <w:pPr>
-        <w:pStyle w:val="NormalWeb"/>
-        <w:numPr>
-          <w:ilvl w:val="0"/>
-          <w:numId w:val="14"/>
-        </w:numPr>
-        <w:rPr>
-          <w:rFonts w:ascii="Arial Narrow" w:hAnsi="Arial Narrow" w:cs="Tahoma"/>
-          <w:sz w:val="20"/>
-        </w:rPr>
-      </w:pPr>
-      <w:r>
-        <w:rPr>
-          <w:rFonts w:ascii="Arial Narrow" w:hAnsi="Arial Narrow" w:cs="Tahoma"/>
-          <w:sz w:val="20"/>
-        </w:rPr>
-        <w:t>Why do they do it? (player motivation</w:t>
-      </w:r>
-      <w:r>
-        <w:rPr>
-          <w:rFonts w:ascii="Arial Narrow" w:hAnsi="Arial Narrow" w:cs="Tahoma"/>
-          <w:sz w:val="20"/>
-        </w:rPr>
-        <w:t>, goals</w:t>
-      </w:r>
-      <w:r>
-        <w:rPr>
-          <w:rFonts w:ascii="Arial Narrow" w:hAnsi="Arial Narrow" w:cs="Tahoma"/>
-          <w:sz w:val="20"/>
-        </w:rPr>
-        <w:t xml:space="preserve">) </w:t>
-      </w:r>
-    </w:p>
-    <w:p>
-      <w:pPr>
-        <w:pStyle w:val="NormalWeb"/>
-        <w:numPr>
-          <w:ilvl w:val="0"/>
-          <w:numId w:val="14"/>
-        </w:numPr>
-        <w:rPr>
-          <w:rFonts w:ascii="Arial Narrow" w:hAnsi="Arial Narrow" w:cs="Tahoma"/>
-          <w:sz w:val="20"/>
-        </w:rPr>
-      </w:pPr>
-      <w:r>
-        <w:rPr>
-          <w:rFonts w:ascii="Arial Narrow" w:hAnsi="Arial Narrow" w:cs="Tahoma"/>
-          <w:sz w:val="20"/>
-        </w:rPr>
-        <w:t>Where does the player do it? (</w:t>
-      </w:r>
-      <w:r>
-        <w:rPr>
-          <w:rFonts w:ascii="Arial Narrow" w:hAnsi="Arial Narrow" w:cs="Tahoma"/>
-          <w:sz w:val="20"/>
-        </w:rPr>
-        <w:t xml:space="preserve">game world, </w:t>
-      </w:r>
-      <w:r>
-        <w:rPr>
-          <w:rFonts w:ascii="Arial Narrow" w:hAnsi="Arial Narrow" w:cs="Tahoma"/>
-          <w:sz w:val="20"/>
-        </w:rPr>
-        <w:t xml:space="preserve">setting, story, narration) </w:t>
-      </w:r>
-    </w:p>
-    <w:p>
-      <w:pPr>
-        <w:pStyle w:val="NormalWeb"/>
-        <w:numPr>
-          <w:ilvl w:val="0"/>
-          <w:numId w:val="14"/>
-        </w:numPr>
-        <w:rPr>
-          <w:rFonts w:ascii="Arial Narrow" w:hAnsi="Arial Narrow" w:cs="Tahoma"/>
-          <w:sz w:val="20"/>
-        </w:rPr>
-      </w:pPr>
-      <w:r>
-        <w:rPr>
-          <w:rFonts w:ascii="Arial Narrow" w:hAnsi="Arial Narrow" w:cs="Tahoma"/>
-          <w:sz w:val="20"/>
-        </w:rPr>
-        <w:t>What are the constraints on the player? (</w:t>
-      </w:r>
-      <w:r>
-        <w:rPr>
-          <w:rFonts w:ascii="Arial Narrow" w:hAnsi="Arial Narrow" w:cs="Tahoma"/>
-          <w:sz w:val="20"/>
-        </w:rPr>
-        <w:t>progress and flow</w:t>
-      </w:r>
-      <w:r>
-        <w:rPr>
-          <w:rFonts w:ascii="Arial Narrow" w:hAnsi="Arial Narrow" w:cs="Tahoma"/>
-          <w:sz w:val="20"/>
-        </w:rPr>
-        <w:t xml:space="preserve">) </w:t>
-      </w:r>
-    </w:p>
-    <w:p>
-      <w:pPr>
-        <w:pStyle w:val="NormalWeb"/>
-        <w:numPr>
-          <w:ilvl w:val="0"/>
-          <w:numId w:val="14"/>
-        </w:numPr>
-        <w:rPr>
-          <w:rFonts w:ascii="Arial Narrow" w:hAnsi="Arial Narrow" w:cs="Tahoma"/>
-          <w:sz w:val="20"/>
-        </w:rPr>
-      </w:pPr>
-      <w:r>
-        <w:rPr>
-          <w:rFonts w:ascii="Arial Narrow" w:hAnsi="Arial Narrow" w:cs="Tahoma"/>
-          <w:sz w:val="20"/>
-        </w:rPr>
-        <w:t>What sort of emotion is this game trying to evoke in the player? (affect</w:t>
-      </w:r>
-      <w:r>
-        <w:rPr>
-          <w:rFonts w:ascii="Arial Narrow" w:hAnsi="Arial Narrow" w:cs="Tahoma"/>
-          <w:sz w:val="20"/>
-        </w:rPr>
-        <w:t>, theme, mood</w:t>
-      </w:r>
-      <w:r>
-        <w:rPr>
-          <w:rFonts w:ascii="Arial Narrow" w:hAnsi="Arial Narrow" w:cs="Tahoma"/>
-          <w:sz w:val="20"/>
-        </w:rPr>
-        <w:t xml:space="preserve">) </w:t>
-      </w:r>
-    </w:p>
-    <w:p>
-      <w:pPr>
-        <w:pStyle w:val="NormalWeb"/>
-        <w:numPr>
-          <w:ilvl w:val="0"/>
-          <w:numId w:val="14"/>
-        </w:numPr>
-        <w:rPr>
-          <w:rFonts w:ascii="Arial Narrow" w:hAnsi="Arial Narrow" w:cs="Tahoma"/>
-          <w:sz w:val="20"/>
-        </w:rPr>
-      </w:pPr>
-      <w:r>
-        <w:rPr>
-          <w:rFonts w:ascii="Arial Narrow" w:hAnsi="Arial Narrow" w:cs="Tahoma"/>
-          <w:sz w:val="20"/>
-        </w:rPr>
-        <w:t>How does the game look and feel? (graphical style, 2D/3D, music, sound)</w:t>
-      </w:r>
-    </w:p>
-    <w:p>
-      <w:pPr>
-        <w:pStyle w:val="NormalWeb"/>
         <w:ind w:left="1440"/>
         <w:rPr>
           <w:rFonts w:ascii="Arial Narrow" w:hAnsi="Arial Narrow" w:cs="Tahoma"/>
@@ -1062,11 +1046,9 @@
           <w:numId w:val="18"/>
         </w:numPr>
       </w:pPr>
-      <w:proofErr w:type="spellStart"/>
-      <w:r>
-        <w:t>Warioware</w:t>
-      </w:r>
-      <w:proofErr w:type="spellEnd"/>
+      <w:r>
+        <w:t>Quick-time</w:t>
+      </w:r>
       <w:r>
         <w:t xml:space="preserve"> Painting</w:t>
       </w:r>
@@ -1118,6 +1100,9 @@
       <w:r>
         <w:t>Mismatched Art Styles</w:t>
       </w:r>
+      <w:r>
+        <w:t xml:space="preserve"> (low poly 3D and higher def 2D elements)</w:t>
+      </w:r>
     </w:p>
     <w:p>
       <w:pPr>
@@ -1138,122 +1123,6 @@
           <w:bottom w:val="single" w:sz="4" w:space="1" w:color="auto"/>
         </w:pBdr>
       </w:pPr>
-    </w:p>
-    <w:p>
-      <w:pPr>
-        <w:pStyle w:val="NormalWeb"/>
-        <w:ind w:left="720"/>
-        <w:rPr>
-          <w:rFonts w:ascii="Arial Narrow" w:hAnsi="Arial Narrow"/>
-          <w:b/>
-          <w:sz w:val="20"/>
-          <w:szCs w:val="20"/>
-        </w:rPr>
-      </w:pPr>
-      <w:r>
-        <w:rPr>
-          <w:rFonts w:ascii="Arial Narrow" w:hAnsi="Arial Narrow"/>
-          <w:b/>
-          <w:sz w:val="20"/>
-          <w:szCs w:val="20"/>
-        </w:rPr>
-        <w:t xml:space="preserve">Please delete the instructions below upon completion of section. </w:t>
-      </w:r>
-    </w:p>
-    <w:p>
-      <w:pPr>
-        <w:pStyle w:val="NormalWeb"/>
-        <w:ind w:left="720"/>
-        <w:rPr>
-          <w:rFonts w:ascii="Arial Narrow" w:hAnsi="Arial Narrow" w:cs="Tahoma"/>
-          <w:sz w:val="20"/>
-        </w:rPr>
-      </w:pPr>
-      <w:r>
-        <w:rPr>
-          <w:rFonts w:ascii="Arial Narrow" w:hAnsi="Arial Narrow" w:cs="Tahoma"/>
-          <w:sz w:val="20"/>
-        </w:rPr>
-        <w:t xml:space="preserve">Create a series of features for the game to support the high-concept statement. At this point the features should be written in a succinct manner, probably in a </w:t>
-      </w:r>
-      <w:r>
-        <w:rPr>
-          <w:rFonts w:ascii="Arial Narrow" w:hAnsi="Arial Narrow" w:cs="Tahoma"/>
-          <w:b/>
-          <w:sz w:val="20"/>
-        </w:rPr>
-        <w:t>bulleted</w:t>
-      </w:r>
-      <w:r>
-        <w:rPr>
-          <w:rFonts w:ascii="Arial Narrow" w:hAnsi="Arial Narrow" w:cs="Tahoma"/>
-          <w:sz w:val="20"/>
-        </w:rPr>
-        <w:t xml:space="preserve"> list. The details will be </w:t>
-      </w:r>
-      <w:r>
-        <w:rPr>
-          <w:rFonts w:ascii="Arial Narrow" w:hAnsi="Arial Narrow" w:cs="Tahoma"/>
-          <w:sz w:val="20"/>
-        </w:rPr>
-        <w:t>fleshed</w:t>
-      </w:r>
-      <w:r>
-        <w:rPr>
-          <w:rFonts w:ascii="Arial Narrow" w:hAnsi="Arial Narrow" w:cs="Tahoma"/>
-          <w:sz w:val="20"/>
-        </w:rPr>
-        <w:t xml:space="preserve"> out later</w:t>
-      </w:r>
-      <w:r>
-        <w:rPr>
-          <w:rFonts w:ascii="Arial Narrow" w:hAnsi="Arial Narrow" w:cs="Tahoma"/>
-          <w:sz w:val="20"/>
-        </w:rPr>
-        <w:t xml:space="preserve">, but you should at least include the core features, or </w:t>
-      </w:r>
-      <w:r>
-        <w:rPr>
-          <w:rFonts w:ascii="Arial Narrow" w:hAnsi="Arial Narrow" w:cs="Tahoma"/>
-          <w:sz w:val="20"/>
-        </w:rPr>
-        <w:t>“</w:t>
-      </w:r>
-      <w:r>
-        <w:rPr>
-          <w:rFonts w:ascii="Arial Narrow" w:hAnsi="Arial Narrow" w:cs="Tahoma"/>
-          <w:sz w:val="20"/>
-        </w:rPr>
-        <w:t xml:space="preserve">the </w:t>
-      </w:r>
-      <w:r>
-        <w:rPr>
-          <w:rFonts w:ascii="Arial Narrow" w:hAnsi="Arial Narrow" w:cs="Tahoma"/>
-          <w:sz w:val="20"/>
-        </w:rPr>
-        <w:t xml:space="preserve">pillars of the </w:t>
-      </w:r>
-      <w:r>
-        <w:rPr>
-          <w:rFonts w:ascii="Arial Narrow" w:hAnsi="Arial Narrow" w:cs="Tahoma"/>
-          <w:sz w:val="20"/>
-        </w:rPr>
-        <w:t>game</w:t>
-      </w:r>
-      <w:r>
-        <w:rPr>
-          <w:rFonts w:ascii="Arial Narrow" w:hAnsi="Arial Narrow" w:cs="Tahoma"/>
-          <w:sz w:val="20"/>
-        </w:rPr>
-        <w:t>”</w:t>
-      </w:r>
-      <w:r>
-        <w:rPr>
-          <w:rFonts w:ascii="Arial Narrow" w:hAnsi="Arial Narrow" w:cs="Tahoma"/>
-          <w:sz w:val="20"/>
-        </w:rPr>
-        <w:t>. Highlight the features that are unique selling points for the game.</w:t>
-      </w:r>
     </w:p>
     <w:p>
       <w:pPr>
@@ -1294,12 +1163,133 @@
     <w:p>
       <w:pPr>
         <w:pStyle w:val="NormalWeb"/>
-        <w:ind w:left="720"/>
-        <w:rPr>
-          <w:rFonts w:ascii="Arial Narrow" w:hAnsi="Arial Narrow"/>
+        <w:numPr>
+          <w:ilvl w:val="0"/>
+          <w:numId w:val="19"/>
+        </w:numPr>
+        <w:rPr>
           <w:sz w:val="20"/>
         </w:rPr>
       </w:pPr>
+      <w:r>
+        <w:t>Stanley Parable</w:t>
+      </w:r>
+      <w:r>
+        <w:t xml:space="preserve"> for vibe/setting</w:t>
+      </w:r>
+    </w:p>
+    <w:p>
+      <w:pPr>
+        <w:pStyle w:val="NormalWeb"/>
+        <w:numPr>
+          <w:ilvl w:val="0"/>
+          <w:numId w:val="19"/>
+        </w:numPr>
+        <w:rPr>
+          <w:sz w:val="20"/>
+        </w:rPr>
+      </w:pPr>
+      <w:r>
+        <w:t>Lethal Company/REPO for aesthetic</w:t>
+      </w:r>
+    </w:p>
+    <w:p>
+      <w:pPr>
+        <w:pStyle w:val="NormalWeb"/>
+        <w:numPr>
+          <w:ilvl w:val="0"/>
+          <w:numId w:val="19"/>
+        </w:numPr>
+        <w:rPr>
+          <w:sz w:val="20"/>
+        </w:rPr>
+      </w:pPr>
+      <w:proofErr w:type="spellStart"/>
+      <w:r>
+        <w:t>WarioWare</w:t>
+      </w:r>
+      <w:proofErr w:type="spellEnd"/>
+      <w:r>
+        <w:t xml:space="preserve"> in puzzles</w:t>
+      </w:r>
+    </w:p>
+    <w:p>
+      <w:pPr>
+        <w:pStyle w:val="NormalWeb"/>
+        <w:numPr>
+          <w:ilvl w:val="0"/>
+          <w:numId w:val="19"/>
+        </w:numPr>
+        <w:rPr>
+          <w:sz w:val="20"/>
+        </w:rPr>
+      </w:pPr>
+      <w:r>
+        <w:t>Better Call Saul for reports puzzles</w:t>
+      </w:r>
+    </w:p>
+    <w:p>
+      <w:pPr>
+        <w:pStyle w:val="NormalWeb"/>
+        <w:numPr>
+          <w:ilvl w:val="0"/>
+          <w:numId w:val="19"/>
+        </w:numPr>
+        <w:rPr>
+          <w:sz w:val="20"/>
+        </w:rPr>
+      </w:pPr>
+      <w:r>
+        <w:t>Competitive Analysis</w:t>
+      </w:r>
+      <w:r>
+        <w:t>/how we are different</w:t>
+      </w:r>
+    </w:p>
+    <w:p>
+      <w:pPr>
+        <w:pStyle w:val="NormalWeb"/>
+        <w:numPr>
+          <w:ilvl w:val="1"/>
+          <w:numId w:val="19"/>
+        </w:numPr>
+        <w:rPr>
+          <w:sz w:val="20"/>
+        </w:rPr>
+      </w:pPr>
+      <w:r>
+        <w:t>Bamboozled directions puzzles differentiate us from the competition by adding new dimensions to how are other puzzle mechanics are implemented</w:t>
+      </w:r>
+    </w:p>
+    <w:p>
+      <w:pPr>
+        <w:pStyle w:val="NormalWeb"/>
+        <w:numPr>
+          <w:ilvl w:val="1"/>
+          <w:numId w:val="19"/>
+        </w:numPr>
+        <w:rPr>
+          <w:sz w:val="20"/>
+        </w:rPr>
+      </w:pPr>
+      <w:r>
+        <w:t xml:space="preserve">Corporate setting adds an additional layer of progression to the game  </w:t>
+      </w:r>
+    </w:p>
+    <w:p>
+      <w:pPr>
+        <w:pStyle w:val="NormalWeb"/>
+        <w:numPr>
+          <w:ilvl w:val="1"/>
+          <w:numId w:val="19"/>
+        </w:numPr>
+        <w:rPr>
+          <w:sz w:val="20"/>
+        </w:rPr>
+      </w:pPr>
+      <w:r>
+        <w:t>Ms Direction as an element adds unique narrative flair to the puzzles</w:t>
+      </w:r>
     </w:p>
     <w:p>
       <w:pPr>
@@ -1317,44 +1307,6 @@
           <w:bottom w:val="single" w:sz="4" w:space="1" w:color="auto"/>
         </w:pBdr>
       </w:pPr>
-    </w:p>
-    <w:p>
-      <w:pPr>
-        <w:pStyle w:val="NormalWeb"/>
-        <w:ind w:left="720"/>
-        <w:rPr>
-          <w:rFonts w:ascii="Arial Narrow" w:hAnsi="Arial Narrow"/>
-          <w:b/>
-          <w:sz w:val="20"/>
-          <w:szCs w:val="20"/>
-        </w:rPr>
-      </w:pPr>
-      <w:r>
-        <w:rPr>
-          <w:rFonts w:ascii="Arial Narrow" w:hAnsi="Arial Narrow"/>
-          <w:b/>
-          <w:sz w:val="20"/>
-          <w:szCs w:val="20"/>
-        </w:rPr>
-        <w:t xml:space="preserve">Please delete the instructions below upon completion of section. </w:t>
-      </w:r>
-    </w:p>
-    <w:p>
-      <w:pPr>
-        <w:pStyle w:val="NormalWeb"/>
-        <w:ind w:left="720"/>
-        <w:rPr>
-          <w:rFonts w:ascii="Arial Narrow" w:hAnsi="Arial Narrow"/>
-          <w:sz w:val="20"/>
-        </w:rPr>
-      </w:pPr>
-      <w:r>
-        <w:rPr>
-          <w:rFonts w:ascii="Arial Narrow" w:hAnsi="Arial Narrow"/>
-          <w:sz w:val="20"/>
-        </w:rPr>
-        <w:t>What were your design influences for this game (can be other games, films, books, life experiences, etc.)? Don’t just list titles, be specific on what aspects influenced your game and in what way. What are other games that are similar in design or target similar players? Also do a short competitive analysis. That is, how does your game differentiate itself from those games? What is unique? What is your competitive advantage.</w:t>
-      </w:r>
     </w:p>
     <w:p>
       <w:pPr>
@@ -1451,6 +1403,9 @@
         </w:pBdr>
       </w:pPr>
       <w:r>
+        <w:rPr>
+          <w:noProof/>
+        </w:rPr>
         <w:drawing>
           <wp:inline distT="0" distB="0" distL="0" distR="0" wp14:anchorId="3542B7F9" wp14:editId="7FA9411B">
             <wp:extent cx="5486400" cy="2955290"/>
@@ -1467,7 +1422,7 @@
                     <pic:cNvPicPr/>
                   </pic:nvPicPr>
                   <pic:blipFill>
-                    <a:blip r:embed="rId7"/>
+                    <a:blip r:embed="rId9"/>
                     <a:stretch>
                       <a:fillRect/>
                     </a:stretch>
@@ -1554,203 +1509,150 @@
         <w:t>Team Roles</w:t>
       </w:r>
     </w:p>
-    <w:p/>
-    <w:p/>
+    <w:p>
+      <w:r>
+        <w:t>Design:</w:t>
+      </w:r>
+    </w:p>
+    <w:p>
+      <w:pPr>
+        <w:pStyle w:val="ListParagraph"/>
+        <w:numPr>
+          <w:ilvl w:val="0"/>
+          <w:numId w:val="20"/>
+        </w:numPr>
+      </w:pPr>
+      <w:r>
+        <w:t>Tyler Eppig</w:t>
+      </w:r>
+    </w:p>
+    <w:p>
+      <w:pPr>
+        <w:pStyle w:val="ListParagraph"/>
+        <w:numPr>
+          <w:ilvl w:val="0"/>
+          <w:numId w:val="20"/>
+        </w:numPr>
+      </w:pPr>
+      <w:r>
+        <w:t>Nolan Wong</w:t>
+      </w:r>
+    </w:p>
+    <w:p>
+      <w:r>
+        <w:t>Art:</w:t>
+      </w:r>
+    </w:p>
+    <w:p>
+      <w:pPr>
+        <w:pStyle w:val="ListParagraph"/>
+        <w:numPr>
+          <w:ilvl w:val="0"/>
+          <w:numId w:val="20"/>
+        </w:numPr>
+      </w:pPr>
+      <w:r>
+        <w:t>Liv English-Saunders</w:t>
+      </w:r>
+    </w:p>
+    <w:p>
+      <w:pPr>
+        <w:pStyle w:val="ListParagraph"/>
+        <w:numPr>
+          <w:ilvl w:val="0"/>
+          <w:numId w:val="20"/>
+        </w:numPr>
+      </w:pPr>
+      <w:r>
+        <w:t>Sean Kavanaugh</w:t>
+      </w:r>
+    </w:p>
+    <w:p>
+      <w:r>
+        <w:t>Programming:</w:t>
+      </w:r>
+    </w:p>
+    <w:p>
+      <w:pPr>
+        <w:pStyle w:val="ListParagraph"/>
+        <w:numPr>
+          <w:ilvl w:val="0"/>
+          <w:numId w:val="20"/>
+        </w:numPr>
+      </w:pPr>
+      <w:r>
+        <w:t xml:space="preserve">Elliot </w:t>
+      </w:r>
+      <w:proofErr w:type="spellStart"/>
+      <w:r>
+        <w:t>Grinnel</w:t>
+      </w:r>
+      <w:proofErr w:type="spellEnd"/>
+    </w:p>
+    <w:p>
+      <w:pPr>
+        <w:pStyle w:val="ListParagraph"/>
+        <w:numPr>
+          <w:ilvl w:val="0"/>
+          <w:numId w:val="20"/>
+        </w:numPr>
+      </w:pPr>
+      <w:r>
+        <w:t>Palash Mathur</w:t>
+      </w:r>
+    </w:p>
+    <w:p>
+      <w:pPr>
+        <w:pStyle w:val="ListParagraph"/>
+        <w:numPr>
+          <w:ilvl w:val="0"/>
+          <w:numId w:val="20"/>
+        </w:numPr>
+      </w:pPr>
+      <w:r>
+        <w:t>Aden Seymour</w:t>
+      </w:r>
+    </w:p>
+    <w:p>
+      <w:r>
+        <w:t>Production:</w:t>
+      </w:r>
+    </w:p>
+    <w:p>
+      <w:pPr>
+        <w:pStyle w:val="ListParagraph"/>
+        <w:numPr>
+          <w:ilvl w:val="0"/>
+          <w:numId w:val="20"/>
+        </w:numPr>
+      </w:pPr>
+      <w:r>
+        <w:t>Palash Mathur</w:t>
+      </w:r>
+    </w:p>
+    <w:p>
+      <w:r>
+        <w:t>Audio:</w:t>
+      </w:r>
+    </w:p>
+    <w:p>
+      <w:pPr>
+        <w:pStyle w:val="ListParagraph"/>
+        <w:numPr>
+          <w:ilvl w:val="0"/>
+          <w:numId w:val="20"/>
+        </w:numPr>
+      </w:pPr>
+      <w:r>
+        <w:t>Tyler Eppig</w:t>
+      </w:r>
+    </w:p>
     <w:p>
       <w:pPr>
         <w:pBdr>
           <w:bottom w:val="single" w:sz="4" w:space="1" w:color="auto"/>
         </w:pBdr>
       </w:pPr>
-    </w:p>
-    <w:p>
-      <w:pPr>
-        <w:pStyle w:val="NormalWeb"/>
-        <w:ind w:left="720"/>
-        <w:rPr>
-          <w:rFonts w:ascii="Arial Narrow" w:hAnsi="Arial Narrow"/>
-          <w:b/>
-          <w:sz w:val="20"/>
-          <w:szCs w:val="20"/>
-        </w:rPr>
-      </w:pPr>
-      <w:r>
-        <w:rPr>
-          <w:rFonts w:ascii="Arial Narrow" w:hAnsi="Arial Narrow"/>
-          <w:b/>
-          <w:sz w:val="20"/>
-          <w:szCs w:val="20"/>
-        </w:rPr>
-        <w:t xml:space="preserve">Please delete the instructions below upon completion of section. </w:t>
-      </w:r>
-    </w:p>
-    <w:p>
-      <w:pPr>
-        <w:pStyle w:val="NormalWeb"/>
-        <w:ind w:left="720"/>
-        <w:rPr>
-          <w:rFonts w:ascii="Arial Narrow" w:hAnsi="Arial Narrow" w:cs="Tahoma"/>
-          <w:sz w:val="20"/>
-        </w:rPr>
-      </w:pPr>
-      <w:r>
-        <w:rPr>
-          <w:rFonts w:ascii="Arial Narrow" w:hAnsi="Arial Narrow" w:cs="Tahoma"/>
-          <w:sz w:val="20"/>
-        </w:rPr>
-        <w:t>Define the roles each team member will perform across the project. Feel free to be more specific than the examples below.</w:t>
-      </w:r>
-    </w:p>
-    <w:p>
-      <w:pPr>
-        <w:pStyle w:val="NormalWeb"/>
-        <w:numPr>
-          <w:ilvl w:val="0"/>
-          <w:numId w:val="17"/>
-        </w:numPr>
-        <w:tabs>
-          <w:tab w:val="clear" w:pos="720"/>
-          <w:tab w:val="num" w:pos="1080"/>
-        </w:tabs>
-        <w:ind w:left="1080"/>
-        <w:rPr>
-          <w:rFonts w:ascii="Arial Narrow" w:hAnsi="Arial Narrow" w:cs="Tahoma"/>
-          <w:sz w:val="20"/>
-          <w:lang w:val="en-US"/>
-        </w:rPr>
-      </w:pPr>
-      <w:r>
-        <w:rPr>
-          <w:rFonts w:ascii="Arial Narrow" w:hAnsi="Arial Narrow" w:cs="Tahoma"/>
-          <w:sz w:val="20"/>
-          <w:lang w:val="en-US"/>
-        </w:rPr>
-        <w:t>Game Designer</w:t>
-      </w:r>
-    </w:p>
-    <w:p>
-      <w:pPr>
-        <w:pStyle w:val="NormalWeb"/>
-        <w:numPr>
-          <w:ilvl w:val="0"/>
-          <w:numId w:val="17"/>
-        </w:numPr>
-        <w:tabs>
-          <w:tab w:val="clear" w:pos="720"/>
-          <w:tab w:val="num" w:pos="1080"/>
-        </w:tabs>
-        <w:ind w:left="1080"/>
-        <w:rPr>
-          <w:rFonts w:ascii="Arial Narrow" w:hAnsi="Arial Narrow" w:cs="Tahoma"/>
-          <w:sz w:val="20"/>
-          <w:lang w:val="en-US"/>
-        </w:rPr>
-      </w:pPr>
-      <w:r>
-        <w:rPr>
-          <w:rFonts w:ascii="Arial Narrow" w:hAnsi="Arial Narrow" w:cs="Tahoma"/>
-          <w:sz w:val="20"/>
-          <w:lang w:val="en-US"/>
-        </w:rPr>
-        <w:t>Programmer</w:t>
-      </w:r>
-    </w:p>
-    <w:p>
-      <w:pPr>
-        <w:pStyle w:val="NormalWeb"/>
-        <w:numPr>
-          <w:ilvl w:val="0"/>
-          <w:numId w:val="17"/>
-        </w:numPr>
-        <w:tabs>
-          <w:tab w:val="clear" w:pos="720"/>
-          <w:tab w:val="num" w:pos="1080"/>
-        </w:tabs>
-        <w:ind w:left="1080"/>
-        <w:rPr>
-          <w:rFonts w:ascii="Arial Narrow" w:hAnsi="Arial Narrow" w:cs="Tahoma"/>
-          <w:sz w:val="20"/>
-          <w:lang w:val="en-US"/>
-        </w:rPr>
-      </w:pPr>
-      <w:r>
-        <w:rPr>
-          <w:rFonts w:ascii="Arial Narrow" w:hAnsi="Arial Narrow" w:cs="Tahoma"/>
-          <w:sz w:val="20"/>
-          <w:lang w:val="en-US"/>
-        </w:rPr>
-        <w:t xml:space="preserve">Artist </w:t>
-      </w:r>
-      <w:r>
-        <w:rPr>
-          <w:rFonts w:ascii="Arial Narrow" w:hAnsi="Arial Narrow" w:cs="Tahoma"/>
-          <w:sz w:val="20"/>
-          <w:lang w:val="en-US"/>
-        </w:rPr>
-        <w:t>(2D, 3D, UI/UX)</w:t>
-      </w:r>
-    </w:p>
-    <w:p>
-      <w:pPr>
-        <w:pStyle w:val="NormalWeb"/>
-        <w:numPr>
-          <w:ilvl w:val="0"/>
-          <w:numId w:val="17"/>
-        </w:numPr>
-        <w:tabs>
-          <w:tab w:val="clear" w:pos="720"/>
-          <w:tab w:val="num" w:pos="1080"/>
-        </w:tabs>
-        <w:ind w:left="1080"/>
-        <w:rPr>
-          <w:rFonts w:ascii="Arial Narrow" w:hAnsi="Arial Narrow" w:cs="Tahoma"/>
-          <w:sz w:val="20"/>
-          <w:lang w:val="en-US"/>
-        </w:rPr>
-      </w:pPr>
-      <w:r>
-        <w:rPr>
-          <w:rFonts w:ascii="Arial Narrow" w:hAnsi="Arial Narrow" w:cs="Tahoma"/>
-          <w:sz w:val="20"/>
-          <w:lang w:val="en-US"/>
-        </w:rPr>
-        <w:t>Sound</w:t>
-      </w:r>
-      <w:r>
-        <w:rPr>
-          <w:rFonts w:ascii="Arial Narrow" w:hAnsi="Arial Narrow" w:cs="Tahoma"/>
-          <w:sz w:val="20"/>
-          <w:lang w:val="en-US"/>
-        </w:rPr>
-        <w:t xml:space="preserve"> Designer </w:t>
-      </w:r>
-    </w:p>
-    <w:p>
-      <w:pPr>
-        <w:pStyle w:val="NormalWeb"/>
-        <w:numPr>
-          <w:ilvl w:val="0"/>
-          <w:numId w:val="17"/>
-        </w:numPr>
-        <w:tabs>
-          <w:tab w:val="clear" w:pos="720"/>
-          <w:tab w:val="num" w:pos="1080"/>
-        </w:tabs>
-        <w:ind w:left="1080"/>
-        <w:rPr>
-          <w:rFonts w:ascii="Arial Narrow" w:hAnsi="Arial Narrow" w:cs="Tahoma"/>
-          <w:sz w:val="20"/>
-          <w:lang w:val="en-US"/>
-        </w:rPr>
-      </w:pPr>
-      <w:r>
-        <w:rPr>
-          <w:rFonts w:ascii="Arial Narrow" w:hAnsi="Arial Narrow" w:cs="Tahoma"/>
-          <w:sz w:val="20"/>
-          <w:lang w:val="en-US"/>
-        </w:rPr>
-        <w:t>Producer / Project Manager</w:t>
-      </w:r>
     </w:p>
     <w:p>
       <w:pPr>
@@ -1786,7 +1688,6 @@
           <w:bCs/>
           <w:sz w:val="20"/>
         </w:rPr>
-        <w:lastRenderedPageBreak/>
         <w:t>SWOT Analysis</w:t>
       </w:r>
     </w:p>
@@ -1898,15 +1799,7 @@
               <w:pStyle w:val="NormalWeb"/>
             </w:pPr>
             <w:r>
-              <w:t xml:space="preserve">What are your </w:t>
-            </w:r>
-            <w:proofErr w:type="gramStart"/>
-            <w:r>
-              <w:t>teams</w:t>
-            </w:r>
-            <w:proofErr w:type="gramEnd"/>
-            <w:r>
-              <w:t xml:space="preserve"> weaknesses?</w:t>
+              <w:t>What are your teams weaknesses?</w:t>
             </w:r>
           </w:p>
           <w:p>
@@ -2103,7 +1996,7 @@
         </w:rPr>
         <w:t xml:space="preserve">Do a SWOT (Strengths, Weaknesses, Opportunities, and Threats) analysis for your game project. Fill in the table above. To learn more about SWOT Analysis </w:t>
       </w:r>
-      <w:hyperlink r:id="rId8" w:history="1">
+      <w:hyperlink r:id="rId10" w:history="1">
         <w:r>
           <w:rPr>
             <w:rStyle w:val="Hyperlink"/>
@@ -2111,7 +2004,25 @@
             <w:sz w:val="20"/>
             <w:lang w:val="en-US"/>
           </w:rPr>
-          <w:t>read this</w:t>
+          <w:t>r</w:t>
+        </w:r>
+        <w:r>
+          <w:rPr>
+            <w:rStyle w:val="Hyperlink"/>
+            <w:rFonts w:ascii="Arial Narrow" w:hAnsi="Arial Narrow"/>
+            <w:sz w:val="20"/>
+            <w:lang w:val="en-US"/>
+          </w:rPr>
+          <w:t>e</w:t>
+        </w:r>
+        <w:r>
+          <w:rPr>
+            <w:rStyle w:val="Hyperlink"/>
+            <w:rFonts w:ascii="Arial Narrow" w:hAnsi="Arial Narrow"/>
+            <w:sz w:val="20"/>
+            <w:lang w:val="en-US"/>
+          </w:rPr>
+          <w:t>ad this</w:t>
         </w:r>
       </w:hyperlink>
       <w:r>
@@ -2122,7 +2033,7 @@
         </w:rPr>
         <w:t xml:space="preserve"> and </w:t>
       </w:r>
-      <w:hyperlink r:id="rId9" w:history="1">
+      <w:hyperlink r:id="rId11" w:history="1">
         <w:r>
           <w:rPr>
             <w:rStyle w:val="Hyperlink"/>
@@ -2187,16 +2098,50 @@
           <w:numId w:val="16"/>
         </w:numPr>
         <w:rPr>
-          <w:rFonts w:ascii="Arial Narrow" w:hAnsi="Arial Narrow"/>
-          <w:sz w:val="20"/>
-        </w:rPr>
-      </w:pPr>
-      <w:r>
-        <w:rPr>
-          <w:rFonts w:ascii="Arial Narrow" w:hAnsi="Arial Narrow"/>
-          <w:sz w:val="20"/>
-        </w:rPr>
-        <w:t>Green Light Features (High Priority)</w:t>
+          <w:lang w:val="en-US"/>
+        </w:rPr>
+      </w:pPr>
+      <w:r>
+        <w:rPr>
+          <w:lang w:val="en-US"/>
+        </w:rPr>
+        <w:t>Green Light  </w:t>
+      </w:r>
+    </w:p>
+    <w:p>
+      <w:pPr>
+        <w:pStyle w:val="NormalWeb"/>
+        <w:numPr>
+          <w:ilvl w:val="1"/>
+          <w:numId w:val="16"/>
+        </w:numPr>
+        <w:rPr>
+          <w:lang w:val="en-US"/>
+        </w:rPr>
+      </w:pPr>
+      <w:r>
+        <w:rPr>
+          <w:lang w:val="en-US"/>
+        </w:rPr>
+        <w:t>3 floors (unique layout), 3 tasks per floor</w:t>
+      </w:r>
+    </w:p>
+    <w:p>
+      <w:pPr>
+        <w:pStyle w:val="NormalWeb"/>
+        <w:numPr>
+          <w:ilvl w:val="1"/>
+          <w:numId w:val="16"/>
+        </w:numPr>
+        <w:rPr>
+          <w:lang w:val="en-US"/>
+        </w:rPr>
+      </w:pPr>
+      <w:r>
+        <w:rPr>
+          <w:lang w:val="en-US"/>
+        </w:rPr>
+        <w:t>1 unique mechanic added each floor</w:t>
       </w:r>
     </w:p>
     <w:p>
@@ -2207,16 +2152,68 @@
           <w:numId w:val="16"/>
         </w:numPr>
         <w:rPr>
-          <w:rFonts w:ascii="Arial Narrow" w:hAnsi="Arial Narrow"/>
-          <w:sz w:val="20"/>
-        </w:rPr>
-      </w:pPr>
-      <w:r>
-        <w:rPr>
-          <w:rFonts w:ascii="Arial Narrow" w:hAnsi="Arial Narrow"/>
-          <w:sz w:val="20"/>
-        </w:rPr>
-        <w:t>Yellow Light Features (Medium Priority)</w:t>
+          <w:lang w:val="en-US"/>
+        </w:rPr>
+      </w:pPr>
+      <w:r>
+        <w:rPr>
+          <w:lang w:val="en-US"/>
+        </w:rPr>
+        <w:t>Yellow Light </w:t>
+      </w:r>
+    </w:p>
+    <w:p>
+      <w:pPr>
+        <w:pStyle w:val="NormalWeb"/>
+        <w:numPr>
+          <w:ilvl w:val="1"/>
+          <w:numId w:val="16"/>
+        </w:numPr>
+        <w:rPr>
+          <w:lang w:val="en-US"/>
+        </w:rPr>
+      </w:pPr>
+      <w:r>
+        <w:rPr>
+          <w:lang w:val="en-US"/>
+        </w:rPr>
+        <w:t>Ms. Direction UI</w:t>
+      </w:r>
+    </w:p>
+    <w:p>
+      <w:pPr>
+        <w:pStyle w:val="NormalWeb"/>
+        <w:numPr>
+          <w:ilvl w:val="1"/>
+          <w:numId w:val="16"/>
+        </w:numPr>
+        <w:rPr>
+          <w:lang w:val="en-US"/>
+        </w:rPr>
+      </w:pPr>
+      <w:r>
+        <w:rPr>
+          <w:lang w:val="en-US"/>
+        </w:rPr>
+        <w:t>Music</w:t>
+      </w:r>
+    </w:p>
+    <w:p>
+      <w:pPr>
+        <w:pStyle w:val="NormalWeb"/>
+        <w:numPr>
+          <w:ilvl w:val="1"/>
+          <w:numId w:val="16"/>
+        </w:numPr>
+        <w:rPr>
+          <w:lang w:val="en-US"/>
+        </w:rPr>
+      </w:pPr>
+      <w:r>
+        <w:rPr>
+          <w:lang w:val="en-US"/>
+        </w:rPr>
+        <w:t>Solution based Feedback</w:t>
       </w:r>
     </w:p>
     <w:p>
@@ -2227,240 +2224,50 @@
           <w:numId w:val="16"/>
         </w:numPr>
         <w:rPr>
-          <w:rFonts w:ascii="Arial Narrow" w:hAnsi="Arial Narrow"/>
-          <w:sz w:val="20"/>
-        </w:rPr>
-      </w:pPr>
-      <w:r>
-        <w:rPr>
-          <w:rFonts w:ascii="Arial Narrow" w:hAnsi="Arial Narrow"/>
-          <w:sz w:val="20"/>
-        </w:rPr>
-        <w:t>Red Light Features (Low Priority)</w:t>
-      </w:r>
-    </w:p>
-    <w:p>
-      <w:pPr>
-        <w:pBdr>
-          <w:bottom w:val="single" w:sz="4" w:space="1" w:color="auto"/>
-        </w:pBdr>
-      </w:pPr>
+          <w:lang w:val="en-US"/>
+        </w:rPr>
+      </w:pPr>
+      <w:r>
+        <w:rPr>
+          <w:lang w:val="en-US"/>
+        </w:rPr>
+        <w:t>Red Light</w:t>
+      </w:r>
     </w:p>
     <w:p>
       <w:pPr>
         <w:pStyle w:val="NormalWeb"/>
-        <w:ind w:left="720"/>
-        <w:rPr>
-          <w:rFonts w:ascii="Arial Narrow" w:hAnsi="Arial Narrow"/>
-          <w:b/>
-          <w:sz w:val="20"/>
-          <w:szCs w:val="20"/>
-        </w:rPr>
-      </w:pPr>
-      <w:r>
-        <w:rPr>
-          <w:rFonts w:ascii="Arial Narrow" w:hAnsi="Arial Narrow"/>
-          <w:b/>
-          <w:sz w:val="20"/>
-          <w:szCs w:val="20"/>
-        </w:rPr>
-        <w:t xml:space="preserve">Please delete the instructions below upon completion of section. </w:t>
+        <w:numPr>
+          <w:ilvl w:val="1"/>
+          <w:numId w:val="16"/>
+        </w:numPr>
+        <w:rPr>
+          <w:lang w:val="en-US"/>
+        </w:rPr>
+      </w:pPr>
+      <w:r>
+        <w:rPr>
+          <w:lang w:val="en-US"/>
+        </w:rPr>
+        <w:t>Lobby</w:t>
       </w:r>
     </w:p>
     <w:p>
       <w:pPr>
         <w:pStyle w:val="NormalWeb"/>
-        <w:ind w:left="720"/>
-        <w:rPr>
-          <w:rFonts w:ascii="Arial Narrow" w:hAnsi="Arial Narrow"/>
-          <w:bCs/>
-          <w:sz w:val="20"/>
-        </w:rPr>
-      </w:pPr>
-      <w:r>
-        <w:rPr>
-          <w:rFonts w:ascii="Arial Narrow" w:hAnsi="Arial Narrow"/>
-          <w:sz w:val="20"/>
-        </w:rPr>
-        <w:t xml:space="preserve">If you were to actually build this game, you often must prioritize game features based on </w:t>
-      </w:r>
-      <w:r>
-        <w:rPr>
-          <w:rFonts w:ascii="Arial Narrow" w:hAnsi="Arial Narrow"/>
-          <w:sz w:val="20"/>
-        </w:rPr>
-        <w:t xml:space="preserve">the limitations of resources you </w:t>
-      </w:r>
-      <w:r>
-        <w:rPr>
-          <w:rFonts w:ascii="Arial Narrow" w:hAnsi="Arial Narrow"/>
-          <w:sz w:val="20"/>
-        </w:rPr>
-        <w:t xml:space="preserve">may </w:t>
-      </w:r>
-      <w:r>
-        <w:rPr>
-          <w:rFonts w:ascii="Arial Narrow" w:hAnsi="Arial Narrow"/>
-          <w:sz w:val="20"/>
-        </w:rPr>
-        <w:t xml:space="preserve">have (time, talent, budget)?  Provide a list of features sorted into </w:t>
-      </w:r>
-      <w:r>
-        <w:rPr>
-          <w:rFonts w:ascii="Arial Narrow" w:hAnsi="Arial Narrow"/>
-          <w:b/>
-          <w:sz w:val="20"/>
-        </w:rPr>
-        <w:t>“green light”</w:t>
-      </w:r>
-      <w:r>
-        <w:rPr>
-          <w:rFonts w:ascii="Arial Narrow" w:hAnsi="Arial Narrow"/>
-          <w:b/>
-          <w:sz w:val="20"/>
-        </w:rPr>
-        <w:t xml:space="preserve"> </w:t>
-      </w:r>
-      <w:r>
-        <w:rPr>
-          <w:rFonts w:ascii="Arial Narrow" w:hAnsi="Arial Narrow"/>
-          <w:bCs/>
-          <w:sz w:val="20"/>
-        </w:rPr>
-        <w:t xml:space="preserve">(aka, “go </w:t>
-      </w:r>
-      <w:proofErr w:type="spellStart"/>
-      <w:r>
-        <w:rPr>
-          <w:rFonts w:ascii="Arial Narrow" w:hAnsi="Arial Narrow"/>
-          <w:bCs/>
-          <w:sz w:val="20"/>
-        </w:rPr>
-        <w:t>go</w:t>
-      </w:r>
-      <w:proofErr w:type="spellEnd"/>
-      <w:r>
-        <w:rPr>
-          <w:rFonts w:ascii="Arial Narrow" w:hAnsi="Arial Narrow"/>
-          <w:bCs/>
-          <w:sz w:val="20"/>
-        </w:rPr>
-        <w:t xml:space="preserve"> </w:t>
-      </w:r>
-      <w:proofErr w:type="spellStart"/>
-      <w:r>
-        <w:rPr>
-          <w:rFonts w:ascii="Arial Narrow" w:hAnsi="Arial Narrow"/>
-          <w:bCs/>
-          <w:sz w:val="20"/>
-        </w:rPr>
-        <w:t>go</w:t>
-      </w:r>
-      <w:proofErr w:type="spellEnd"/>
-      <w:r>
-        <w:rPr>
-          <w:rFonts w:ascii="Arial Narrow" w:hAnsi="Arial Narrow"/>
-          <w:bCs/>
-          <w:sz w:val="20"/>
-        </w:rPr>
-        <w:t>!” – must have features</w:t>
-      </w:r>
-      <w:r>
-        <w:rPr>
-          <w:rFonts w:ascii="Arial Narrow" w:hAnsi="Arial Narrow"/>
-          <w:bCs/>
-          <w:sz w:val="20"/>
-        </w:rPr>
-        <w:t xml:space="preserve"> for the </w:t>
-      </w:r>
-      <w:r>
-        <w:rPr>
-          <w:rFonts w:ascii="Arial Narrow" w:hAnsi="Arial Narrow"/>
-          <w:bCs/>
-          <w:sz w:val="20"/>
-          <w:u w:val="single"/>
-        </w:rPr>
-        <w:t>minimal viable product</w:t>
-      </w:r>
-      <w:r>
-        <w:rPr>
-          <w:rFonts w:ascii="Arial Narrow" w:hAnsi="Arial Narrow"/>
-          <w:bCs/>
-          <w:sz w:val="20"/>
-        </w:rPr>
-        <w:t>, aka MVP</w:t>
-      </w:r>
-      <w:r>
-        <w:rPr>
-          <w:rFonts w:ascii="Arial Narrow" w:hAnsi="Arial Narrow"/>
-          <w:bCs/>
-          <w:sz w:val="20"/>
-        </w:rPr>
-        <w:t xml:space="preserve">), </w:t>
-      </w:r>
-      <w:r>
-        <w:rPr>
-          <w:rFonts w:ascii="Arial Narrow" w:hAnsi="Arial Narrow"/>
-          <w:b/>
-          <w:sz w:val="20"/>
-        </w:rPr>
-        <w:t>“yellow light”</w:t>
-      </w:r>
-      <w:r>
-        <w:rPr>
-          <w:rFonts w:ascii="Arial Narrow" w:hAnsi="Arial Narrow"/>
-          <w:bCs/>
-          <w:sz w:val="20"/>
-        </w:rPr>
-        <w:t xml:space="preserve"> (aka, “yield” – stretch features that you ideally would have but may have to yield on some of them due to </w:t>
-      </w:r>
-      <w:r>
-        <w:rPr>
-          <w:rFonts w:ascii="Arial Narrow" w:hAnsi="Arial Narrow"/>
-          <w:bCs/>
-          <w:sz w:val="20"/>
-        </w:rPr>
-        <w:t>resource</w:t>
-      </w:r>
-      <w:r>
-        <w:rPr>
-          <w:rFonts w:ascii="Arial Narrow" w:hAnsi="Arial Narrow"/>
-          <w:bCs/>
-          <w:sz w:val="20"/>
-        </w:rPr>
-        <w:t xml:space="preserve"> constraints), and </w:t>
-      </w:r>
-      <w:r>
-        <w:rPr>
-          <w:rFonts w:ascii="Arial Narrow" w:hAnsi="Arial Narrow"/>
-          <w:b/>
-          <w:sz w:val="20"/>
-        </w:rPr>
-        <w:t>“red light”</w:t>
-      </w:r>
-      <w:r>
-        <w:rPr>
-          <w:rFonts w:ascii="Arial Narrow" w:hAnsi="Arial Narrow"/>
-          <w:bCs/>
-          <w:sz w:val="20"/>
-        </w:rPr>
-        <w:t xml:space="preserve"> (aka, “stop” – stretch features that you most likely will not have time or resources to add at this point</w:t>
-      </w:r>
-      <w:r>
-        <w:rPr>
-          <w:rFonts w:ascii="Arial Narrow" w:hAnsi="Arial Narrow"/>
-          <w:bCs/>
-          <w:sz w:val="20"/>
-        </w:rPr>
-        <w:t xml:space="preserve"> but you want to document in case additional resources become available or perhaps features that could be included in future game updates or sequels</w:t>
-      </w:r>
-      <w:r>
-        <w:rPr>
-          <w:rFonts w:ascii="Arial Narrow" w:hAnsi="Arial Narrow"/>
-          <w:bCs/>
-          <w:sz w:val="20"/>
-        </w:rPr>
-        <w:t>).</w:t>
+        <w:numPr>
+          <w:ilvl w:val="1"/>
+          <w:numId w:val="16"/>
+        </w:numPr>
+        <w:rPr>
+          <w:lang w:val="en-US"/>
+        </w:rPr>
+      </w:pPr>
+      <w:r>
+        <w:rPr>
+          <w:lang w:val="en-US"/>
+        </w:rPr>
+        <w:t>Voice Acting</w:t>
       </w:r>
     </w:p>
     <w:p>
@@ -2498,7 +2305,6 @@
           <w:bCs/>
           <w:sz w:val="20"/>
         </w:rPr>
-        <w:lastRenderedPageBreak/>
         <w:t>Timeline</w:t>
       </w:r>
     </w:p>
@@ -2565,12 +2371,12 @@
       </w:pPr>
     </w:p>
     <w:sectPr>
-      <w:headerReference w:type="even" r:id="rId10"/>
-      <w:headerReference w:type="default" r:id="rId11"/>
-      <w:footerReference w:type="even" r:id="rId12"/>
-      <w:footerReference w:type="default" r:id="rId13"/>
-      <w:headerReference w:type="first" r:id="rId14"/>
-      <w:footerReference w:type="first" r:id="rId15"/>
+      <w:headerReference w:type="even" r:id="rId12"/>
+      <w:headerReference w:type="default" r:id="rId13"/>
+      <w:footerReference w:type="even" r:id="rId14"/>
+      <w:footerReference w:type="default" r:id="rId15"/>
+      <w:headerReference w:type="first" r:id="rId16"/>
+      <w:footerReference w:type="first" r:id="rId17"/>
       <w:pgSz w:w="12240" w:h="15840"/>
       <w:pgMar w:top="1440" w:right="1800" w:bottom="1440" w:left="1800" w:header="706" w:footer="706" w:gutter="0"/>
       <w:pgBorders w:offsetFrom="page">
@@ -2876,7 +2682,7 @@
         <w:sz w:val="20"/>
         <w:lang w:val="en-US"/>
       </w:rPr>
-      <w:t>2026-09-29</w:t>
+      <w:t>2026-09-30</w:t>
     </w:r>
     <w:r>
       <w:rPr>
@@ -3206,6 +3012,119 @@
     </w:lvl>
   </w:abstractNum>
   <w:abstractNum w:abstractNumId="11" w15:restartNumberingAfterBreak="0">
+    <w:nsid w:val="0C4D1766"/>
+    <w:multiLevelType w:val="hybridMultilevel"/>
+    <w:tmpl w:val="CC765F0C"/>
+    <w:lvl w:ilvl="0" w:tplc="04090001">
+      <w:start w:val="1"/>
+      <w:numFmt w:val="bullet"/>
+      <w:lvlText w:val=""/>
+      <w:lvlJc w:val="left"/>
+      <w:pPr>
+        <w:ind w:left="1440" w:hanging="360"/>
+      </w:pPr>
+      <w:rPr>
+        <w:rFonts w:ascii="Symbol" w:hAnsi="Symbol" w:hint="default"/>
+      </w:rPr>
+    </w:lvl>
+    <w:lvl w:ilvl="1" w:tplc="04090003">
+      <w:start w:val="1"/>
+      <w:numFmt w:val="bullet"/>
+      <w:lvlText w:val="o"/>
+      <w:lvlJc w:val="left"/>
+      <w:pPr>
+        <w:ind w:left="2160" w:hanging="360"/>
+      </w:pPr>
+      <w:rPr>
+        <w:rFonts w:ascii="Courier New" w:hAnsi="Courier New" w:cs="Courier New" w:hint="default"/>
+      </w:rPr>
+    </w:lvl>
+    <w:lvl w:ilvl="2" w:tplc="04090005" w:tentative="1">
+      <w:start w:val="1"/>
+      <w:numFmt w:val="bullet"/>
+      <w:lvlText w:val=""/>
+      <w:lvlJc w:val="left"/>
+      <w:pPr>
+        <w:ind w:left="2880" w:hanging="360"/>
+      </w:pPr>
+      <w:rPr>
+        <w:rFonts w:ascii="Wingdings" w:hAnsi="Wingdings" w:hint="default"/>
+      </w:rPr>
+    </w:lvl>
+    <w:lvl w:ilvl="3" w:tplc="04090001" w:tentative="1">
+      <w:start w:val="1"/>
+      <w:numFmt w:val="bullet"/>
+      <w:lvlText w:val=""/>
+      <w:lvlJc w:val="left"/>
+      <w:pPr>
+        <w:ind w:left="3600" w:hanging="360"/>
+      </w:pPr>
+      <w:rPr>
+        <w:rFonts w:ascii="Symbol" w:hAnsi="Symbol" w:hint="default"/>
+      </w:rPr>
+    </w:lvl>
+    <w:lvl w:ilvl="4" w:tplc="04090003" w:tentative="1">
+      <w:start w:val="1"/>
+      <w:numFmt w:val="bullet"/>
+      <w:lvlText w:val="o"/>
+      <w:lvlJc w:val="left"/>
+      <w:pPr>
+        <w:ind w:left="4320" w:hanging="360"/>
+      </w:pPr>
+      <w:rPr>
+        <w:rFonts w:ascii="Courier New" w:hAnsi="Courier New" w:cs="Courier New" w:hint="default"/>
+      </w:rPr>
+    </w:lvl>
+    <w:lvl w:ilvl="5" w:tplc="04090005" w:tentative="1">
+      <w:start w:val="1"/>
+      <w:numFmt w:val="bullet"/>
+      <w:lvlText w:val=""/>
+      <w:lvlJc w:val="left"/>
+      <w:pPr>
+        <w:ind w:left="5040" w:hanging="360"/>
+      </w:pPr>
+      <w:rPr>
+        <w:rFonts w:ascii="Wingdings" w:hAnsi="Wingdings" w:hint="default"/>
+      </w:rPr>
+    </w:lvl>
+    <w:lvl w:ilvl="6" w:tplc="04090001" w:tentative="1">
+      <w:start w:val="1"/>
+      <w:numFmt w:val="bullet"/>
+      <w:lvlText w:val=""/>
+      <w:lvlJc w:val="left"/>
+      <w:pPr>
+        <w:ind w:left="5760" w:hanging="360"/>
+      </w:pPr>
+      <w:rPr>
+        <w:rFonts w:ascii="Symbol" w:hAnsi="Symbol" w:hint="default"/>
+      </w:rPr>
+    </w:lvl>
+    <w:lvl w:ilvl="7" w:tplc="04090003" w:tentative="1">
+      <w:start w:val="1"/>
+      <w:numFmt w:val="bullet"/>
+      <w:lvlText w:val="o"/>
+      <w:lvlJc w:val="left"/>
+      <w:pPr>
+        <w:ind w:left="6480" w:hanging="360"/>
+      </w:pPr>
+      <w:rPr>
+        <w:rFonts w:ascii="Courier New" w:hAnsi="Courier New" w:cs="Courier New" w:hint="default"/>
+      </w:rPr>
+    </w:lvl>
+    <w:lvl w:ilvl="8" w:tplc="04090005" w:tentative="1">
+      <w:start w:val="1"/>
+      <w:numFmt w:val="bullet"/>
+      <w:lvlText w:val=""/>
+      <w:lvlJc w:val="left"/>
+      <w:pPr>
+        <w:ind w:left="7200" w:hanging="360"/>
+      </w:pPr>
+      <w:rPr>
+        <w:rFonts w:ascii="Wingdings" w:hAnsi="Wingdings" w:hint="default"/>
+      </w:rPr>
+    </w:lvl>
+  </w:abstractNum>
+  <w:abstractNum w:abstractNumId="12" w15:restartNumberingAfterBreak="0">
     <w:nsid w:val="13FA24EA"/>
     <w:multiLevelType w:val="hybridMultilevel"/>
     <w:tmpl w:val="A538F9B4"/>
@@ -3344,7 +3263,7 @@
       </w:rPr>
     </w:lvl>
   </w:abstractNum>
-  <w:abstractNum w:abstractNumId="12" w15:restartNumberingAfterBreak="0">
+  <w:abstractNum w:abstractNumId="13" w15:restartNumberingAfterBreak="0">
     <w:nsid w:val="1A207011"/>
     <w:multiLevelType w:val="multilevel"/>
     <w:tmpl w:val="1F382F3C"/>
@@ -3493,7 +3412,7 @@
       </w:rPr>
     </w:lvl>
   </w:abstractNum>
-  <w:abstractNum w:abstractNumId="13" w15:restartNumberingAfterBreak="0">
+  <w:abstractNum w:abstractNumId="14" w15:restartNumberingAfterBreak="0">
     <w:nsid w:val="32163CD0"/>
     <w:multiLevelType w:val="hybridMultilevel"/>
     <w:tmpl w:val="13480808"/>
@@ -3632,7 +3551,7 @@
       </w:rPr>
     </w:lvl>
   </w:abstractNum>
-  <w:abstractNum w:abstractNumId="14" w15:restartNumberingAfterBreak="0">
+  <w:abstractNum w:abstractNumId="15" w15:restartNumberingAfterBreak="0">
     <w:nsid w:val="33835987"/>
     <w:multiLevelType w:val="hybridMultilevel"/>
     <w:tmpl w:val="C3B814B6"/>
@@ -3745,7 +3664,156 @@
       </w:rPr>
     </w:lvl>
   </w:abstractNum>
-  <w:abstractNum w:abstractNumId="15" w15:restartNumberingAfterBreak="0">
+  <w:abstractNum w:abstractNumId="16" w15:restartNumberingAfterBreak="0">
+    <w:nsid w:val="34A614FB"/>
+    <w:multiLevelType w:val="multilevel"/>
+    <w:tmpl w:val="23D4F8FA"/>
+    <w:lvl w:ilvl="0">
+      <w:start w:val="1"/>
+      <w:numFmt w:val="bullet"/>
+      <w:lvlText w:val=""/>
+      <w:lvlJc w:val="left"/>
+      <w:pPr>
+        <w:tabs>
+          <w:tab w:val="num" w:pos="720"/>
+        </w:tabs>
+        <w:ind w:left="720" w:hanging="360"/>
+      </w:pPr>
+      <w:rPr>
+        <w:rFonts w:ascii="Symbol" w:hAnsi="Symbol" w:hint="default"/>
+        <w:sz w:val="20"/>
+      </w:rPr>
+    </w:lvl>
+    <w:lvl w:ilvl="1" w:tentative="1">
+      <w:start w:val="1"/>
+      <w:numFmt w:val="bullet"/>
+      <w:lvlText w:val="o"/>
+      <w:lvlJc w:val="left"/>
+      <w:pPr>
+        <w:tabs>
+          <w:tab w:val="num" w:pos="1440"/>
+        </w:tabs>
+        <w:ind w:left="1440" w:hanging="360"/>
+      </w:pPr>
+      <w:rPr>
+        <w:rFonts w:ascii="Courier New" w:hAnsi="Courier New" w:hint="default"/>
+        <w:sz w:val="20"/>
+      </w:rPr>
+    </w:lvl>
+    <w:lvl w:ilvl="2" w:tentative="1">
+      <w:start w:val="1"/>
+      <w:numFmt w:val="bullet"/>
+      <w:lvlText w:val=""/>
+      <w:lvlJc w:val="left"/>
+      <w:pPr>
+        <w:tabs>
+          <w:tab w:val="num" w:pos="2160"/>
+        </w:tabs>
+        <w:ind w:left="2160" w:hanging="360"/>
+      </w:pPr>
+      <w:rPr>
+        <w:rFonts w:ascii="Wingdings" w:hAnsi="Wingdings" w:hint="default"/>
+        <w:sz w:val="20"/>
+      </w:rPr>
+    </w:lvl>
+    <w:lvl w:ilvl="3" w:tentative="1">
+      <w:start w:val="1"/>
+      <w:numFmt w:val="bullet"/>
+      <w:lvlText w:val=""/>
+      <w:lvlJc w:val="left"/>
+      <w:pPr>
+        <w:tabs>
+          <w:tab w:val="num" w:pos="2880"/>
+        </w:tabs>
+        <w:ind w:left="2880" w:hanging="360"/>
+      </w:pPr>
+      <w:rPr>
+        <w:rFonts w:ascii="Wingdings" w:hAnsi="Wingdings" w:hint="default"/>
+        <w:sz w:val="20"/>
+      </w:rPr>
+    </w:lvl>
+    <w:lvl w:ilvl="4" w:tentative="1">
+      <w:start w:val="1"/>
+      <w:numFmt w:val="bullet"/>
+      <w:lvlText w:val=""/>
+      <w:lvlJc w:val="left"/>
+      <w:pPr>
+        <w:tabs>
+          <w:tab w:val="num" w:pos="3600"/>
+        </w:tabs>
+        <w:ind w:left="3600" w:hanging="360"/>
+      </w:pPr>
+      <w:rPr>
+        <w:rFonts w:ascii="Wingdings" w:hAnsi="Wingdings" w:hint="default"/>
+        <w:sz w:val="20"/>
+      </w:rPr>
+    </w:lvl>
+    <w:lvl w:ilvl="5" w:tentative="1">
+      <w:start w:val="1"/>
+      <w:numFmt w:val="bullet"/>
+      <w:lvlText w:val=""/>
+      <w:lvlJc w:val="left"/>
+      <w:pPr>
+        <w:tabs>
+          <w:tab w:val="num" w:pos="4320"/>
+        </w:tabs>
+        <w:ind w:left="4320" w:hanging="360"/>
+      </w:pPr>
+      <w:rPr>
+        <w:rFonts w:ascii="Wingdings" w:hAnsi="Wingdings" w:hint="default"/>
+        <w:sz w:val="20"/>
+      </w:rPr>
+    </w:lvl>
+    <w:lvl w:ilvl="6" w:tentative="1">
+      <w:start w:val="1"/>
+      <w:numFmt w:val="bullet"/>
+      <w:lvlText w:val=""/>
+      <w:lvlJc w:val="left"/>
+      <w:pPr>
+        <w:tabs>
+          <w:tab w:val="num" w:pos="5040"/>
+        </w:tabs>
+        <w:ind w:left="5040" w:hanging="360"/>
+      </w:pPr>
+      <w:rPr>
+        <w:rFonts w:ascii="Wingdings" w:hAnsi="Wingdings" w:hint="default"/>
+        <w:sz w:val="20"/>
+      </w:rPr>
+    </w:lvl>
+    <w:lvl w:ilvl="7" w:tentative="1">
+      <w:start w:val="1"/>
+      <w:numFmt w:val="bullet"/>
+      <w:lvlText w:val=""/>
+      <w:lvlJc w:val="left"/>
+      <w:pPr>
+        <w:tabs>
+          <w:tab w:val="num" w:pos="5760"/>
+        </w:tabs>
+        <w:ind w:left="5760" w:hanging="360"/>
+      </w:pPr>
+      <w:rPr>
+        <w:rFonts w:ascii="Wingdings" w:hAnsi="Wingdings" w:hint="default"/>
+        <w:sz w:val="20"/>
+      </w:rPr>
+    </w:lvl>
+    <w:lvl w:ilvl="8" w:tentative="1">
+      <w:start w:val="1"/>
+      <w:numFmt w:val="bullet"/>
+      <w:lvlText w:val=""/>
+      <w:lvlJc w:val="left"/>
+      <w:pPr>
+        <w:tabs>
+          <w:tab w:val="num" w:pos="6480"/>
+        </w:tabs>
+        <w:ind w:left="6480" w:hanging="360"/>
+      </w:pPr>
+      <w:rPr>
+        <w:rFonts w:ascii="Wingdings" w:hAnsi="Wingdings" w:hint="default"/>
+        <w:sz w:val="20"/>
+      </w:rPr>
+    </w:lvl>
+  </w:abstractNum>
+  <w:abstractNum w:abstractNumId="17" w15:restartNumberingAfterBreak="0">
     <w:nsid w:val="4CDA79F8"/>
     <w:multiLevelType w:val="hybridMultilevel"/>
     <w:tmpl w:val="EBA238AA"/>
@@ -3858,7 +3926,7 @@
       </w:rPr>
     </w:lvl>
   </w:abstractNum>
-  <w:abstractNum w:abstractNumId="16" w15:restartNumberingAfterBreak="0">
+  <w:abstractNum w:abstractNumId="18" w15:restartNumberingAfterBreak="0">
     <w:nsid w:val="4FE7271A"/>
     <w:multiLevelType w:val="hybridMultilevel"/>
     <w:tmpl w:val="8A1CEBB6"/>
@@ -3999,7 +4067,268 @@
       </w:rPr>
     </w:lvl>
   </w:abstractNum>
-  <w:abstractNum w:abstractNumId="17" w15:restartNumberingAfterBreak="0">
+  <w:abstractNum w:abstractNumId="19" w15:restartNumberingAfterBreak="0">
+    <w:nsid w:val="513A644F"/>
+    <w:multiLevelType w:val="multilevel"/>
+    <w:tmpl w:val="DCE03DCC"/>
+    <w:lvl w:ilvl="0">
+      <w:start w:val="1"/>
+      <w:numFmt w:val="bullet"/>
+      <w:lvlText w:val=""/>
+      <w:lvlJc w:val="left"/>
+      <w:pPr>
+        <w:tabs>
+          <w:tab w:val="num" w:pos="720"/>
+        </w:tabs>
+        <w:ind w:left="720" w:hanging="360"/>
+      </w:pPr>
+      <w:rPr>
+        <w:rFonts w:ascii="Symbol" w:hAnsi="Symbol" w:hint="default"/>
+        <w:sz w:val="20"/>
+      </w:rPr>
+    </w:lvl>
+    <w:lvl w:ilvl="1" w:tentative="1">
+      <w:start w:val="1"/>
+      <w:numFmt w:val="bullet"/>
+      <w:lvlText w:val="o"/>
+      <w:lvlJc w:val="left"/>
+      <w:pPr>
+        <w:tabs>
+          <w:tab w:val="num" w:pos="1440"/>
+        </w:tabs>
+        <w:ind w:left="1440" w:hanging="360"/>
+      </w:pPr>
+      <w:rPr>
+        <w:rFonts w:ascii="Courier New" w:hAnsi="Courier New" w:hint="default"/>
+        <w:sz w:val="20"/>
+      </w:rPr>
+    </w:lvl>
+    <w:lvl w:ilvl="2" w:tentative="1">
+      <w:start w:val="1"/>
+      <w:numFmt w:val="bullet"/>
+      <w:lvlText w:val=""/>
+      <w:lvlJc w:val="left"/>
+      <w:pPr>
+        <w:tabs>
+          <w:tab w:val="num" w:pos="2160"/>
+        </w:tabs>
+        <w:ind w:left="2160" w:hanging="360"/>
+      </w:pPr>
+      <w:rPr>
+        <w:rFonts w:ascii="Wingdings" w:hAnsi="Wingdings" w:hint="default"/>
+        <w:sz w:val="20"/>
+      </w:rPr>
+    </w:lvl>
+    <w:lvl w:ilvl="3" w:tentative="1">
+      <w:start w:val="1"/>
+      <w:numFmt w:val="bullet"/>
+      <w:lvlText w:val=""/>
+      <w:lvlJc w:val="left"/>
+      <w:pPr>
+        <w:tabs>
+          <w:tab w:val="num" w:pos="2880"/>
+        </w:tabs>
+        <w:ind w:left="2880" w:hanging="360"/>
+      </w:pPr>
+      <w:rPr>
+        <w:rFonts w:ascii="Wingdings" w:hAnsi="Wingdings" w:hint="default"/>
+        <w:sz w:val="20"/>
+      </w:rPr>
+    </w:lvl>
+    <w:lvl w:ilvl="4" w:tentative="1">
+      <w:start w:val="1"/>
+      <w:numFmt w:val="bullet"/>
+      <w:lvlText w:val=""/>
+      <w:lvlJc w:val="left"/>
+      <w:pPr>
+        <w:tabs>
+          <w:tab w:val="num" w:pos="3600"/>
+        </w:tabs>
+        <w:ind w:left="3600" w:hanging="360"/>
+      </w:pPr>
+      <w:rPr>
+        <w:rFonts w:ascii="Wingdings" w:hAnsi="Wingdings" w:hint="default"/>
+        <w:sz w:val="20"/>
+      </w:rPr>
+    </w:lvl>
+    <w:lvl w:ilvl="5" w:tentative="1">
+      <w:start w:val="1"/>
+      <w:numFmt w:val="bullet"/>
+      <w:lvlText w:val=""/>
+      <w:lvlJc w:val="left"/>
+      <w:pPr>
+        <w:tabs>
+          <w:tab w:val="num" w:pos="4320"/>
+        </w:tabs>
+        <w:ind w:left="4320" w:hanging="360"/>
+      </w:pPr>
+      <w:rPr>
+        <w:rFonts w:ascii="Wingdings" w:hAnsi="Wingdings" w:hint="default"/>
+        <w:sz w:val="20"/>
+      </w:rPr>
+    </w:lvl>
+    <w:lvl w:ilvl="6" w:tentative="1">
+      <w:start w:val="1"/>
+      <w:numFmt w:val="bullet"/>
+      <w:lvlText w:val=""/>
+      <w:lvlJc w:val="left"/>
+      <w:pPr>
+        <w:tabs>
+          <w:tab w:val="num" w:pos="5040"/>
+        </w:tabs>
+        <w:ind w:left="5040" w:hanging="360"/>
+      </w:pPr>
+      <w:rPr>
+        <w:rFonts w:ascii="Wingdings" w:hAnsi="Wingdings" w:hint="default"/>
+        <w:sz w:val="20"/>
+      </w:rPr>
+    </w:lvl>
+    <w:lvl w:ilvl="7" w:tentative="1">
+      <w:start w:val="1"/>
+      <w:numFmt w:val="bullet"/>
+      <w:lvlText w:val=""/>
+      <w:lvlJc w:val="left"/>
+      <w:pPr>
+        <w:tabs>
+          <w:tab w:val="num" w:pos="5760"/>
+        </w:tabs>
+        <w:ind w:left="5760" w:hanging="360"/>
+      </w:pPr>
+      <w:rPr>
+        <w:rFonts w:ascii="Wingdings" w:hAnsi="Wingdings" w:hint="default"/>
+        <w:sz w:val="20"/>
+      </w:rPr>
+    </w:lvl>
+    <w:lvl w:ilvl="8" w:tentative="1">
+      <w:start w:val="1"/>
+      <w:numFmt w:val="bullet"/>
+      <w:lvlText w:val=""/>
+      <w:lvlJc w:val="left"/>
+      <w:pPr>
+        <w:tabs>
+          <w:tab w:val="num" w:pos="6480"/>
+        </w:tabs>
+        <w:ind w:left="6480" w:hanging="360"/>
+      </w:pPr>
+      <w:rPr>
+        <w:rFonts w:ascii="Wingdings" w:hAnsi="Wingdings" w:hint="default"/>
+        <w:sz w:val="20"/>
+      </w:rPr>
+    </w:lvl>
+  </w:abstractNum>
+  <w:abstractNum w:abstractNumId="20" w15:restartNumberingAfterBreak="0">
+    <w:nsid w:val="710231A3"/>
+    <w:multiLevelType w:val="hybridMultilevel"/>
+    <w:tmpl w:val="A1C82584"/>
+    <w:lvl w:ilvl="0" w:tplc="67ACB40C">
+      <w:numFmt w:val="bullet"/>
+      <w:lvlText w:val="-"/>
+      <w:lvlJc w:val="left"/>
+      <w:pPr>
+        <w:ind w:left="720" w:hanging="360"/>
+      </w:pPr>
+      <w:rPr>
+        <w:rFonts w:ascii="Times New Roman" w:eastAsia="Times New Roman" w:hAnsi="Times New Roman" w:cs="Times New Roman" w:hint="default"/>
+      </w:rPr>
+    </w:lvl>
+    <w:lvl w:ilvl="1" w:tplc="04090003" w:tentative="1">
+      <w:start w:val="1"/>
+      <w:numFmt w:val="bullet"/>
+      <w:lvlText w:val="o"/>
+      <w:lvlJc w:val="left"/>
+      <w:pPr>
+        <w:ind w:left="1440" w:hanging="360"/>
+      </w:pPr>
+      <w:rPr>
+        <w:rFonts w:ascii="Courier New" w:hAnsi="Courier New" w:cs="Courier New" w:hint="default"/>
+      </w:rPr>
+    </w:lvl>
+    <w:lvl w:ilvl="2" w:tplc="04090005" w:tentative="1">
+      <w:start w:val="1"/>
+      <w:numFmt w:val="bullet"/>
+      <w:lvlText w:val=""/>
+      <w:lvlJc w:val="left"/>
+      <w:pPr>
+        <w:ind w:left="2160" w:hanging="360"/>
+      </w:pPr>
+      <w:rPr>
+        <w:rFonts w:ascii="Wingdings" w:hAnsi="Wingdings" w:hint="default"/>
+      </w:rPr>
+    </w:lvl>
+    <w:lvl w:ilvl="3" w:tplc="04090001" w:tentative="1">
+      <w:start w:val="1"/>
+      <w:numFmt w:val="bullet"/>
+      <w:lvlText w:val=""/>
+      <w:lvlJc w:val="left"/>
+      <w:pPr>
+        <w:ind w:left="2880" w:hanging="360"/>
+      </w:pPr>
+      <w:rPr>
+        <w:rFonts w:ascii="Symbol" w:hAnsi="Symbol" w:hint="default"/>
+      </w:rPr>
+    </w:lvl>
+    <w:lvl w:ilvl="4" w:tplc="04090003" w:tentative="1">
+      <w:start w:val="1"/>
+      <w:numFmt w:val="bullet"/>
+      <w:lvlText w:val="o"/>
+      <w:lvlJc w:val="left"/>
+      <w:pPr>
+        <w:ind w:left="3600" w:hanging="360"/>
+      </w:pPr>
+      <w:rPr>
+        <w:rFonts w:ascii="Courier New" w:hAnsi="Courier New" w:cs="Courier New" w:hint="default"/>
+      </w:rPr>
+    </w:lvl>
+    <w:lvl w:ilvl="5" w:tplc="04090005" w:tentative="1">
+      <w:start w:val="1"/>
+      <w:numFmt w:val="bullet"/>
+      <w:lvlText w:val=""/>
+      <w:lvlJc w:val="left"/>
+      <w:pPr>
+        <w:ind w:left="4320" w:hanging="360"/>
+      </w:pPr>
+      <w:rPr>
+        <w:rFonts w:ascii="Wingdings" w:hAnsi="Wingdings" w:hint="default"/>
+      </w:rPr>
+    </w:lvl>
+    <w:lvl w:ilvl="6" w:tplc="04090001" w:tentative="1">
+      <w:start w:val="1"/>
+      <w:numFmt w:val="bullet"/>
+      <w:lvlText w:val=""/>
+      <w:lvlJc w:val="left"/>
+      <w:pPr>
+        <w:ind w:left="5040" w:hanging="360"/>
+      </w:pPr>
+      <w:rPr>
+        <w:rFonts w:ascii="Symbol" w:hAnsi="Symbol" w:hint="default"/>
+      </w:rPr>
+    </w:lvl>
+    <w:lvl w:ilvl="7" w:tplc="04090003" w:tentative="1">
+      <w:start w:val="1"/>
+      <w:numFmt w:val="bullet"/>
+      <w:lvlText w:val="o"/>
+      <w:lvlJc w:val="left"/>
+      <w:pPr>
+        <w:ind w:left="5760" w:hanging="360"/>
+      </w:pPr>
+      <w:rPr>
+        <w:rFonts w:ascii="Courier New" w:hAnsi="Courier New" w:cs="Courier New" w:hint="default"/>
+      </w:rPr>
+    </w:lvl>
+    <w:lvl w:ilvl="8" w:tplc="04090005" w:tentative="1">
+      <w:start w:val="1"/>
+      <w:numFmt w:val="bullet"/>
+      <w:lvlText w:val=""/>
+      <w:lvlJc w:val="left"/>
+      <w:pPr>
+        <w:ind w:left="6480" w:hanging="360"/>
+      </w:pPr>
+      <w:rPr>
+        <w:rFonts w:ascii="Wingdings" w:hAnsi="Wingdings" w:hint="default"/>
+      </w:rPr>
+    </w:lvl>
+  </w:abstractNum>
+  <w:abstractNum w:abstractNumId="21" w15:restartNumberingAfterBreak="0">
     <w:nsid w:val="773171DD"/>
     <w:multiLevelType w:val="hybridMultilevel"/>
     <w:tmpl w:val="DCD0A470"/>
@@ -4015,7 +4344,7 @@
         <w:rFonts w:ascii="Symbol" w:hAnsi="Symbol" w:hint="default"/>
       </w:rPr>
     </w:lvl>
-    <w:lvl w:ilvl="1" w:tplc="04090003" w:tentative="1">
+    <w:lvl w:ilvl="1" w:tplc="04090003">
       <w:start w:val="1"/>
       <w:numFmt w:val="bullet"/>
       <w:lvlText w:val="o"/>
@@ -4109,14 +4438,163 @@
       </w:pPr>
       <w:rPr>
         <w:rFonts w:ascii="Wingdings" w:hAnsi="Wingdings" w:hint="default"/>
+      </w:rPr>
+    </w:lvl>
+  </w:abstractNum>
+  <w:abstractNum w:abstractNumId="22" w15:restartNumberingAfterBreak="0">
+    <w:nsid w:val="7C162F90"/>
+    <w:multiLevelType w:val="multilevel"/>
+    <w:tmpl w:val="B8CE5434"/>
+    <w:lvl w:ilvl="0">
+      <w:start w:val="1"/>
+      <w:numFmt w:val="bullet"/>
+      <w:lvlText w:val=""/>
+      <w:lvlJc w:val="left"/>
+      <w:pPr>
+        <w:tabs>
+          <w:tab w:val="num" w:pos="720"/>
+        </w:tabs>
+        <w:ind w:left="720" w:hanging="360"/>
+      </w:pPr>
+      <w:rPr>
+        <w:rFonts w:ascii="Symbol" w:hAnsi="Symbol" w:hint="default"/>
+        <w:sz w:val="20"/>
+      </w:rPr>
+    </w:lvl>
+    <w:lvl w:ilvl="1" w:tentative="1">
+      <w:start w:val="1"/>
+      <w:numFmt w:val="bullet"/>
+      <w:lvlText w:val="o"/>
+      <w:lvlJc w:val="left"/>
+      <w:pPr>
+        <w:tabs>
+          <w:tab w:val="num" w:pos="1440"/>
+        </w:tabs>
+        <w:ind w:left="1440" w:hanging="360"/>
+      </w:pPr>
+      <w:rPr>
+        <w:rFonts w:ascii="Courier New" w:hAnsi="Courier New" w:hint="default"/>
+        <w:sz w:val="20"/>
+      </w:rPr>
+    </w:lvl>
+    <w:lvl w:ilvl="2" w:tentative="1">
+      <w:start w:val="1"/>
+      <w:numFmt w:val="bullet"/>
+      <w:lvlText w:val=""/>
+      <w:lvlJc w:val="left"/>
+      <w:pPr>
+        <w:tabs>
+          <w:tab w:val="num" w:pos="2160"/>
+        </w:tabs>
+        <w:ind w:left="2160" w:hanging="360"/>
+      </w:pPr>
+      <w:rPr>
+        <w:rFonts w:ascii="Wingdings" w:hAnsi="Wingdings" w:hint="default"/>
+        <w:sz w:val="20"/>
+      </w:rPr>
+    </w:lvl>
+    <w:lvl w:ilvl="3" w:tentative="1">
+      <w:start w:val="1"/>
+      <w:numFmt w:val="bullet"/>
+      <w:lvlText w:val=""/>
+      <w:lvlJc w:val="left"/>
+      <w:pPr>
+        <w:tabs>
+          <w:tab w:val="num" w:pos="2880"/>
+        </w:tabs>
+        <w:ind w:left="2880" w:hanging="360"/>
+      </w:pPr>
+      <w:rPr>
+        <w:rFonts w:ascii="Wingdings" w:hAnsi="Wingdings" w:hint="default"/>
+        <w:sz w:val="20"/>
+      </w:rPr>
+    </w:lvl>
+    <w:lvl w:ilvl="4" w:tentative="1">
+      <w:start w:val="1"/>
+      <w:numFmt w:val="bullet"/>
+      <w:lvlText w:val=""/>
+      <w:lvlJc w:val="left"/>
+      <w:pPr>
+        <w:tabs>
+          <w:tab w:val="num" w:pos="3600"/>
+        </w:tabs>
+        <w:ind w:left="3600" w:hanging="360"/>
+      </w:pPr>
+      <w:rPr>
+        <w:rFonts w:ascii="Wingdings" w:hAnsi="Wingdings" w:hint="default"/>
+        <w:sz w:val="20"/>
+      </w:rPr>
+    </w:lvl>
+    <w:lvl w:ilvl="5" w:tentative="1">
+      <w:start w:val="1"/>
+      <w:numFmt w:val="bullet"/>
+      <w:lvlText w:val=""/>
+      <w:lvlJc w:val="left"/>
+      <w:pPr>
+        <w:tabs>
+          <w:tab w:val="num" w:pos="4320"/>
+        </w:tabs>
+        <w:ind w:left="4320" w:hanging="360"/>
+      </w:pPr>
+      <w:rPr>
+        <w:rFonts w:ascii="Wingdings" w:hAnsi="Wingdings" w:hint="default"/>
+        <w:sz w:val="20"/>
+      </w:rPr>
+    </w:lvl>
+    <w:lvl w:ilvl="6" w:tentative="1">
+      <w:start w:val="1"/>
+      <w:numFmt w:val="bullet"/>
+      <w:lvlText w:val=""/>
+      <w:lvlJc w:val="left"/>
+      <w:pPr>
+        <w:tabs>
+          <w:tab w:val="num" w:pos="5040"/>
+        </w:tabs>
+        <w:ind w:left="5040" w:hanging="360"/>
+      </w:pPr>
+      <w:rPr>
+        <w:rFonts w:ascii="Wingdings" w:hAnsi="Wingdings" w:hint="default"/>
+        <w:sz w:val="20"/>
+      </w:rPr>
+    </w:lvl>
+    <w:lvl w:ilvl="7" w:tentative="1">
+      <w:start w:val="1"/>
+      <w:numFmt w:val="bullet"/>
+      <w:lvlText w:val=""/>
+      <w:lvlJc w:val="left"/>
+      <w:pPr>
+        <w:tabs>
+          <w:tab w:val="num" w:pos="5760"/>
+        </w:tabs>
+        <w:ind w:left="5760" w:hanging="360"/>
+      </w:pPr>
+      <w:rPr>
+        <w:rFonts w:ascii="Wingdings" w:hAnsi="Wingdings" w:hint="default"/>
+        <w:sz w:val="20"/>
+      </w:rPr>
+    </w:lvl>
+    <w:lvl w:ilvl="8" w:tentative="1">
+      <w:start w:val="1"/>
+      <w:numFmt w:val="bullet"/>
+      <w:lvlText w:val=""/>
+      <w:lvlJc w:val="left"/>
+      <w:pPr>
+        <w:tabs>
+          <w:tab w:val="num" w:pos="6480"/>
+        </w:tabs>
+        <w:ind w:left="6480" w:hanging="360"/>
+      </w:pPr>
+      <w:rPr>
+        <w:rFonts w:ascii="Wingdings" w:hAnsi="Wingdings" w:hint="default"/>
+        <w:sz w:val="20"/>
       </w:rPr>
     </w:lvl>
   </w:abstractNum>
   <w:num w:numId="1" w16cid:durableId="270630497">
-    <w:abstractNumId w:val="16"/>
+    <w:abstractNumId w:val="18"/>
   </w:num>
   <w:num w:numId="2" w16cid:durableId="166361742">
-    <w:abstractNumId w:val="13"/>
+    <w:abstractNumId w:val="14"/>
   </w:num>
   <w:num w:numId="3" w16cid:durableId="436367894">
     <w:abstractNumId w:val="9"/>
@@ -4149,22 +4627,37 @@
     <w:abstractNumId w:val="0"/>
   </w:num>
   <w:num w:numId="13" w16cid:durableId="653989692">
-    <w:abstractNumId w:val="11"/>
+    <w:abstractNumId w:val="12"/>
   </w:num>
   <w:num w:numId="14" w16cid:durableId="1939872476">
-    <w:abstractNumId w:val="15"/>
+    <w:abstractNumId w:val="17"/>
   </w:num>
   <w:num w:numId="15" w16cid:durableId="2018924449">
     <w:abstractNumId w:val="10"/>
   </w:num>
   <w:num w:numId="16" w16cid:durableId="80953368">
-    <w:abstractNumId w:val="17"/>
+    <w:abstractNumId w:val="21"/>
   </w:num>
   <w:num w:numId="17" w16cid:durableId="1240138385">
-    <w:abstractNumId w:val="12"/>
+    <w:abstractNumId w:val="13"/>
   </w:num>
   <w:num w:numId="18" w16cid:durableId="1314211772">
-    <w:abstractNumId w:val="14"/>
+    <w:abstractNumId w:val="15"/>
+  </w:num>
+  <w:num w:numId="19" w16cid:durableId="1339966885">
+    <w:abstractNumId w:val="11"/>
+  </w:num>
+  <w:num w:numId="20" w16cid:durableId="1654601749">
+    <w:abstractNumId w:val="20"/>
+  </w:num>
+  <w:num w:numId="21" w16cid:durableId="58752343">
+    <w:abstractNumId w:val="19"/>
+  </w:num>
+  <w:num w:numId="22" w16cid:durableId="225068546">
+    <w:abstractNumId w:val="16"/>
+  </w:num>
+  <w:num w:numId="23" w16cid:durableId="1794519671">
+    <w:abstractNumId w:val="22"/>
   </w:num>
 </w:numbering>
 </file>
@@ -4609,7 +5102,6 @@
   <w:style w:type="character" w:default="1" w:styleId="DefaultParagraphFont">
     <w:name w:val="Default Paragraph Font"/>
     <w:uiPriority w:val="1"/>
-    <w:semiHidden/>
     <w:unhideWhenUsed/>
   </w:style>
   <w:style w:type="table" w:default="1" w:styleId="TableNormal">

</xml_diff>